<commit_message>
feat: absen offline bisa titip di HP teman (maks 5 orang per HP)
- Profil offline disimpan per QrCodeId (migrasi otomatis dari format 1 profil)
- Login Badge offline: PIN menentukan profil; wajah tetap dicocokkan 1:1
- Tiap Badge online: semua profil titipan diperbarui dari server,
  karyawan nonaktif terhapus; titipan 30 hari tidak dipakai terhapus
  (pemilik HP tidak)
- Daftar "Tersimpan di HP ini (n/5)" dengan tombol hapus di Digital Badge
- IndexedDB pakai 1 koneksi + tutup saat versionchange
- Guide Operation Book v5.2 (Bab 4.3 titip HP + troubleshooting)

Co-Authored-By: Claude Opus 5.5 <noreply@anthropic.com>
</commit_message>
<xml_diff>
--- a/Guide_Operation_Book_SmartGate_Fusion4.docx
+++ b/Guide_Operation_Book_SmartGate_Fusion4.docx
@@ -16,7 +16,7 @@
           <w:noProof/>
         </w:rPr>
         <w:drawing>
-          <wp:inline distT="0" distB="0" distL="0" distR="0" wp14:anchorId="15FCD3BD" wp14:editId="1F53AB7D">
+          <wp:inline distT="0" distB="0" distL="0" distR="0" wp14:anchorId="41F9436B" wp14:editId="129C475A">
             <wp:extent cx="1143000" cy="1133475"/>
             <wp:effectExtent l="0" t="0" r="0" b="0"/>
             <wp:docPr id="1" name="Picture 1"/>
@@ -138,7 +138,7 @@
           <w:sz w:val="22"/>
           <w:szCs w:val="22"/>
         </w:rPr>
-        <w:t>Versi 5.1 — 29 September 2026</w:t>
+        <w:t>Versi 5.2 — 30 September 2026</w:t>
       </w:r>
     </w:p>
     <w:p>
@@ -173,7 +173,7 @@
       <w:pPr>
         <w:pStyle w:val="Heading1"/>
       </w:pPr>
-      <w:bookmarkStart w:id="0" w:name="_Toc241614715"/>
+      <w:bookmarkStart w:id="0" w:name="_Toc241652101"/>
       <w:r>
         <w:lastRenderedPageBreak/>
         <w:t>Lembar Pengesahan &amp; Riwayat Revisi</w:t>
@@ -203,7 +203,7 @@
           <w:left w:w="10" w:type="dxa"/>
           <w:right w:w="10" w:type="dxa"/>
         </w:tblCellMar>
-        <w:tblLook w:val="04A0" w:firstRow="1" w:lastRow="0" w:firstColumn="1" w:lastColumn="0" w:noHBand="0" w:noVBand="1"/>
+        <w:tblLook w:val="0000" w:firstRow="0" w:lastRow="0" w:firstColumn="0" w:lastColumn="0" w:noHBand="0" w:noVBand="0"/>
       </w:tblPr>
       <w:tblGrid>
         <w:gridCol w:w="2400"/>
@@ -566,7 +566,7 @@
           <w:left w:w="10" w:type="dxa"/>
           <w:right w:w="10" w:type="dxa"/>
         </w:tblCellMar>
-        <w:tblLook w:val="04A0" w:firstRow="1" w:lastRow="0" w:firstColumn="1" w:lastColumn="0" w:noHBand="0" w:noVBand="1"/>
+        <w:tblLook w:val="0000" w:firstRow="0" w:lastRow="0" w:firstColumn="0" w:lastColumn="0" w:noHBand="0" w:noVBand="0"/>
       </w:tblPr>
       <w:tblGrid>
         <w:gridCol w:w="1000"/>
@@ -928,6 +928,92 @@
           </w:p>
         </w:tc>
       </w:tr>
+      <w:tr>
+        <w:tblPrEx>
+          <w:tblCellMar>
+            <w:top w:w="0" w:type="dxa"/>
+            <w:bottom w:w="0" w:type="dxa"/>
+          </w:tblCellMar>
+        </w:tblPrEx>
+        <w:trPr>
+          <w:cantSplit/>
+        </w:trPr>
+        <w:tc>
+          <w:tcPr>
+            <w:tcW w:w="1000" w:type="dxa"/>
+            <w:shd w:val="clear" w:color="auto" w:fill="F3F5F8"/>
+            <w:tcMar>
+              <w:top w:w="70" w:type="dxa"/>
+              <w:left w:w="110" w:type="dxa"/>
+              <w:bottom w:w="70" w:type="dxa"/>
+              <w:right w:w="110" w:type="dxa"/>
+            </w:tcMar>
+            <w:vAlign w:val="center"/>
+          </w:tcPr>
+          <w:p>
+            <w:pPr>
+              <w:spacing w:after="20"/>
+            </w:pPr>
+            <w:r>
+              <w:rPr>
+                <w:sz w:val="19"/>
+                <w:szCs w:val="19"/>
+              </w:rPr>
+              <w:t>5.2</w:t>
+            </w:r>
+          </w:p>
+        </w:tc>
+        <w:tc>
+          <w:tcPr>
+            <w:tcW w:w="1500" w:type="dxa"/>
+            <w:shd w:val="clear" w:color="auto" w:fill="F3F5F8"/>
+            <w:tcMar>
+              <w:top w:w="70" w:type="dxa"/>
+              <w:left w:w="110" w:type="dxa"/>
+              <w:bottom w:w="70" w:type="dxa"/>
+              <w:right w:w="110" w:type="dxa"/>
+            </w:tcMar>
+            <w:vAlign w:val="center"/>
+          </w:tcPr>
+          <w:p>
+            <w:pPr>
+              <w:spacing w:after="20"/>
+            </w:pPr>
+            <w:r>
+              <w:rPr>
+                <w:sz w:val="19"/>
+                <w:szCs w:val="19"/>
+              </w:rPr>
+              <w:t>30 Sep 2026</w:t>
+            </w:r>
+          </w:p>
+        </w:tc>
+        <w:tc>
+          <w:tcPr>
+            <w:tcW w:w="7138" w:type="dxa"/>
+            <w:shd w:val="clear" w:color="auto" w:fill="F3F5F8"/>
+            <w:tcMar>
+              <w:top w:w="70" w:type="dxa"/>
+              <w:left w:w="110" w:type="dxa"/>
+              <w:bottom w:w="70" w:type="dxa"/>
+              <w:right w:w="110" w:type="dxa"/>
+            </w:tcMar>
+            <w:vAlign w:val="center"/>
+          </w:tcPr>
+          <w:p>
+            <w:pPr>
+              <w:spacing w:after="20"/>
+            </w:pPr>
+            <w:r>
+              <w:rPr>
+                <w:sz w:val="19"/>
+                <w:szCs w:val="19"/>
+              </w:rPr>
+              <w:t>Absen offline: titip di HP teman, maks 5 orang per HP, data titipan diperbarui otomatis saat online, karyawan nonaktif terhapus, titipan 30 hari tidak dipakai terhapus otomatis (Bab 4.3).</w:t>
+            </w:r>
+          </w:p>
+        </w:tc>
+      </w:tr>
     </w:tbl>
     <w:p>
       <w:r>
@@ -956,7 +1042,7 @@
     <w:sdt>
       <w:sdtPr>
         <w:alias w:val="Daftar Isi"/>
-        <w:id w:val="921680110"/>
+        <w:id w:val="-841390006"/>
       </w:sdtPr>
       <w:sdtEndPr/>
       <w:sdtContent>
@@ -984,7 +1070,7 @@
           <w:r>
             <w:fldChar w:fldCharType="separate"/>
           </w:r>
-          <w:hyperlink w:anchor="_Toc241614715" w:history="1">
+          <w:hyperlink w:anchor="_Toc241652101" w:history="1">
             <w:r>
               <w:rPr>
                 <w:rStyle w:val="Hyperlink"/>
@@ -1008,7 +1094,7 @@
               <w:rPr>
                 <w:noProof/>
               </w:rPr>
-              <w:instrText xml:space="preserve"> PAGEREF _Toc241614715 \h </w:instrText>
+              <w:instrText xml:space="preserve"> PAGEREF _Toc241652101 \h </w:instrText>
             </w:r>
             <w:r>
               <w:rPr>
@@ -1050,7 +1136,7 @@
               <w14:ligatures w14:val="standardContextual"/>
             </w:rPr>
           </w:pPr>
-          <w:hyperlink w:anchor="_Toc241614716" w:history="1">
+          <w:hyperlink w:anchor="_Toc241652102" w:history="1">
             <w:r>
               <w:rPr>
                 <w:rStyle w:val="Hyperlink"/>
@@ -1074,7 +1160,7 @@
               <w:rPr>
                 <w:noProof/>
               </w:rPr>
-              <w:instrText xml:space="preserve"> PAGEREF _Toc241614716 \h </w:instrText>
+              <w:instrText xml:space="preserve"> PAGEREF _Toc241652102 \h </w:instrText>
             </w:r>
             <w:r>
               <w:rPr>
@@ -1116,7 +1202,7 @@
               <w14:ligatures w14:val="standardContextual"/>
             </w:rPr>
           </w:pPr>
-          <w:hyperlink w:anchor="_Toc241614717" w:history="1">
+          <w:hyperlink w:anchor="_Toc241652103" w:history="1">
             <w:r>
               <w:rPr>
                 <w:rStyle w:val="Hyperlink"/>
@@ -1140,7 +1226,7 @@
               <w:rPr>
                 <w:noProof/>
               </w:rPr>
-              <w:instrText xml:space="preserve"> PAGEREF _Toc241614717 \h </w:instrText>
+              <w:instrText xml:space="preserve"> PAGEREF _Toc241652103 \h </w:instrText>
             </w:r>
             <w:r>
               <w:rPr>
@@ -1182,7 +1268,7 @@
               <w14:ligatures w14:val="standardContextual"/>
             </w:rPr>
           </w:pPr>
-          <w:hyperlink w:anchor="_Toc241614718" w:history="1">
+          <w:hyperlink w:anchor="_Toc241652104" w:history="1">
             <w:r>
               <w:rPr>
                 <w:rStyle w:val="Hyperlink"/>
@@ -1206,7 +1292,7 @@
               <w:rPr>
                 <w:noProof/>
               </w:rPr>
-              <w:instrText xml:space="preserve"> PAGEREF _Toc241614718 \h </w:instrText>
+              <w:instrText xml:space="preserve"> PAGEREF _Toc241652104 \h </w:instrText>
             </w:r>
             <w:r>
               <w:rPr>
@@ -1248,7 +1334,7 @@
               <w14:ligatures w14:val="standardContextual"/>
             </w:rPr>
           </w:pPr>
-          <w:hyperlink w:anchor="_Toc241614719" w:history="1">
+          <w:hyperlink w:anchor="_Toc241652105" w:history="1">
             <w:r>
               <w:rPr>
                 <w:rStyle w:val="Hyperlink"/>
@@ -1272,7 +1358,7 @@
               <w:rPr>
                 <w:noProof/>
               </w:rPr>
-              <w:instrText xml:space="preserve"> PAGEREF _Toc241614719 \h </w:instrText>
+              <w:instrText xml:space="preserve"> PAGEREF _Toc241652105 \h </w:instrText>
             </w:r>
             <w:r>
               <w:rPr>
@@ -1314,7 +1400,7 @@
               <w14:ligatures w14:val="standardContextual"/>
             </w:rPr>
           </w:pPr>
-          <w:hyperlink w:anchor="_Toc241614720" w:history="1">
+          <w:hyperlink w:anchor="_Toc241652106" w:history="1">
             <w:r>
               <w:rPr>
                 <w:rStyle w:val="Hyperlink"/>
@@ -1338,7 +1424,7 @@
               <w:rPr>
                 <w:noProof/>
               </w:rPr>
-              <w:instrText xml:space="preserve"> PAGEREF _Toc241614720 \h </w:instrText>
+              <w:instrText xml:space="preserve"> PAGEREF _Toc241652106 \h </w:instrText>
             </w:r>
             <w:r>
               <w:rPr>
@@ -1380,7 +1466,7 @@
               <w14:ligatures w14:val="standardContextual"/>
             </w:rPr>
           </w:pPr>
-          <w:hyperlink w:anchor="_Toc241614721" w:history="1">
+          <w:hyperlink w:anchor="_Toc241652107" w:history="1">
             <w:r>
               <w:rPr>
                 <w:rStyle w:val="Hyperlink"/>
@@ -1404,7 +1490,7 @@
               <w:rPr>
                 <w:noProof/>
               </w:rPr>
-              <w:instrText xml:space="preserve"> PAGEREF _Toc241614721 \h </w:instrText>
+              <w:instrText xml:space="preserve"> PAGEREF _Toc241652107 \h </w:instrText>
             </w:r>
             <w:r>
               <w:rPr>
@@ -1446,7 +1532,7 @@
               <w14:ligatures w14:val="standardContextual"/>
             </w:rPr>
           </w:pPr>
-          <w:hyperlink w:anchor="_Toc241614722" w:history="1">
+          <w:hyperlink w:anchor="_Toc241652108" w:history="1">
             <w:r>
               <w:rPr>
                 <w:rStyle w:val="Hyperlink"/>
@@ -1470,7 +1556,7 @@
               <w:rPr>
                 <w:noProof/>
               </w:rPr>
-              <w:instrText xml:space="preserve"> PAGEREF _Toc241614722 \h </w:instrText>
+              <w:instrText xml:space="preserve"> PAGEREF _Toc241652108 \h </w:instrText>
             </w:r>
             <w:r>
               <w:rPr>
@@ -1512,7 +1598,7 @@
               <w14:ligatures w14:val="standardContextual"/>
             </w:rPr>
           </w:pPr>
-          <w:hyperlink w:anchor="_Toc241614723" w:history="1">
+          <w:hyperlink w:anchor="_Toc241652109" w:history="1">
             <w:r>
               <w:rPr>
                 <w:rStyle w:val="Hyperlink"/>
@@ -1536,7 +1622,7 @@
               <w:rPr>
                 <w:noProof/>
               </w:rPr>
-              <w:instrText xml:space="preserve"> PAGEREF _Toc241614723 \h </w:instrText>
+              <w:instrText xml:space="preserve"> PAGEREF _Toc241652109 \h </w:instrText>
             </w:r>
             <w:r>
               <w:rPr>
@@ -1578,7 +1664,7 @@
               <w14:ligatures w14:val="standardContextual"/>
             </w:rPr>
           </w:pPr>
-          <w:hyperlink w:anchor="_Toc241614724" w:history="1">
+          <w:hyperlink w:anchor="_Toc241652110" w:history="1">
             <w:r>
               <w:rPr>
                 <w:rStyle w:val="Hyperlink"/>
@@ -1602,7 +1688,7 @@
               <w:rPr>
                 <w:noProof/>
               </w:rPr>
-              <w:instrText xml:space="preserve"> PAGEREF _Toc241614724 \h </w:instrText>
+              <w:instrText xml:space="preserve"> PAGEREF _Toc241652110 \h </w:instrText>
             </w:r>
             <w:r>
               <w:rPr>
@@ -1644,7 +1730,7 @@
               <w14:ligatures w14:val="standardContextual"/>
             </w:rPr>
           </w:pPr>
-          <w:hyperlink w:anchor="_Toc241614725" w:history="1">
+          <w:hyperlink w:anchor="_Toc241652111" w:history="1">
             <w:r>
               <w:rPr>
                 <w:rStyle w:val="Hyperlink"/>
@@ -1668,7 +1754,7 @@
               <w:rPr>
                 <w:noProof/>
               </w:rPr>
-              <w:instrText xml:space="preserve"> PAGEREF _Toc241614725 \h </w:instrText>
+              <w:instrText xml:space="preserve"> PAGEREF _Toc241652111 \h </w:instrText>
             </w:r>
             <w:r>
               <w:rPr>
@@ -1710,7 +1796,7 @@
               <w14:ligatures w14:val="standardContextual"/>
             </w:rPr>
           </w:pPr>
-          <w:hyperlink w:anchor="_Toc241614726" w:history="1">
+          <w:hyperlink w:anchor="_Toc241652112" w:history="1">
             <w:r>
               <w:rPr>
                 <w:rStyle w:val="Hyperlink"/>
@@ -1734,7 +1820,7 @@
               <w:rPr>
                 <w:noProof/>
               </w:rPr>
-              <w:instrText xml:space="preserve"> PAGEREF _Toc241614726 \h </w:instrText>
+              <w:instrText xml:space="preserve"> PAGEREF _Toc241652112 \h </w:instrText>
             </w:r>
             <w:r>
               <w:rPr>
@@ -1776,7 +1862,7 @@
               <w14:ligatures w14:val="standardContextual"/>
             </w:rPr>
           </w:pPr>
-          <w:hyperlink w:anchor="_Toc241614727" w:history="1">
+          <w:hyperlink w:anchor="_Toc241652113" w:history="1">
             <w:r>
               <w:rPr>
                 <w:rStyle w:val="Hyperlink"/>
@@ -1800,7 +1886,7 @@
               <w:rPr>
                 <w:noProof/>
               </w:rPr>
-              <w:instrText xml:space="preserve"> PAGEREF _Toc241614727 \h </w:instrText>
+              <w:instrText xml:space="preserve"> PAGEREF _Toc241652113 \h </w:instrText>
             </w:r>
             <w:r>
               <w:rPr>
@@ -1842,7 +1928,7 @@
               <w14:ligatures w14:val="standardContextual"/>
             </w:rPr>
           </w:pPr>
-          <w:hyperlink w:anchor="_Toc241614728" w:history="1">
+          <w:hyperlink w:anchor="_Toc241652114" w:history="1">
             <w:r>
               <w:rPr>
                 <w:rStyle w:val="Hyperlink"/>
@@ -1866,7 +1952,7 @@
               <w:rPr>
                 <w:noProof/>
               </w:rPr>
-              <w:instrText xml:space="preserve"> PAGEREF _Toc241614728 \h </w:instrText>
+              <w:instrText xml:space="preserve"> PAGEREF _Toc241652114 \h </w:instrText>
             </w:r>
             <w:r>
               <w:rPr>
@@ -1908,7 +1994,7 @@
               <w14:ligatures w14:val="standardContextual"/>
             </w:rPr>
           </w:pPr>
-          <w:hyperlink w:anchor="_Toc241614729" w:history="1">
+          <w:hyperlink w:anchor="_Toc241652115" w:history="1">
             <w:r>
               <w:rPr>
                 <w:rStyle w:val="Hyperlink"/>
@@ -1932,7 +2018,7 @@
               <w:rPr>
                 <w:noProof/>
               </w:rPr>
-              <w:instrText xml:space="preserve"> PAGEREF _Toc241614729 \h </w:instrText>
+              <w:instrText xml:space="preserve"> PAGEREF _Toc241652115 \h </w:instrText>
             </w:r>
             <w:r>
               <w:rPr>
@@ -1974,7 +2060,7 @@
               <w14:ligatures w14:val="standardContextual"/>
             </w:rPr>
           </w:pPr>
-          <w:hyperlink w:anchor="_Toc241614730" w:history="1">
+          <w:hyperlink w:anchor="_Toc241652116" w:history="1">
             <w:r>
               <w:rPr>
                 <w:rStyle w:val="Hyperlink"/>
@@ -1998,7 +2084,7 @@
               <w:rPr>
                 <w:noProof/>
               </w:rPr>
-              <w:instrText xml:space="preserve"> PAGEREF _Toc241614730 \h </w:instrText>
+              <w:instrText xml:space="preserve"> PAGEREF _Toc241652116 \h </w:instrText>
             </w:r>
             <w:r>
               <w:rPr>
@@ -2040,7 +2126,7 @@
               <w14:ligatures w14:val="standardContextual"/>
             </w:rPr>
           </w:pPr>
-          <w:hyperlink w:anchor="_Toc241614731" w:history="1">
+          <w:hyperlink w:anchor="_Toc241652117" w:history="1">
             <w:r>
               <w:rPr>
                 <w:rStyle w:val="Hyperlink"/>
@@ -2064,7 +2150,7 @@
               <w:rPr>
                 <w:noProof/>
               </w:rPr>
-              <w:instrText xml:space="preserve"> PAGEREF _Toc241614731 \h </w:instrText>
+              <w:instrText xml:space="preserve"> PAGEREF _Toc241652117 \h </w:instrText>
             </w:r>
             <w:r>
               <w:rPr>
@@ -2106,7 +2192,7 @@
               <w14:ligatures w14:val="standardContextual"/>
             </w:rPr>
           </w:pPr>
-          <w:hyperlink w:anchor="_Toc241614732" w:history="1">
+          <w:hyperlink w:anchor="_Toc241652118" w:history="1">
             <w:r>
               <w:rPr>
                 <w:rStyle w:val="Hyperlink"/>
@@ -2130,7 +2216,7 @@
               <w:rPr>
                 <w:noProof/>
               </w:rPr>
-              <w:instrText xml:space="preserve"> PAGEREF _Toc241614732 \h </w:instrText>
+              <w:instrText xml:space="preserve"> PAGEREF _Toc241652118 \h </w:instrText>
             </w:r>
             <w:r>
               <w:rPr>
@@ -2172,7 +2258,7 @@
               <w14:ligatures w14:val="standardContextual"/>
             </w:rPr>
           </w:pPr>
-          <w:hyperlink w:anchor="_Toc241614733" w:history="1">
+          <w:hyperlink w:anchor="_Toc241652119" w:history="1">
             <w:r>
               <w:rPr>
                 <w:rStyle w:val="Hyperlink"/>
@@ -2196,7 +2282,7 @@
               <w:rPr>
                 <w:noProof/>
               </w:rPr>
-              <w:instrText xml:space="preserve"> PAGEREF _Toc241614733 \h </w:instrText>
+              <w:instrText xml:space="preserve"> PAGEREF _Toc241652119 \h </w:instrText>
             </w:r>
             <w:r>
               <w:rPr>
@@ -2238,7 +2324,7 @@
               <w14:ligatures w14:val="standardContextual"/>
             </w:rPr>
           </w:pPr>
-          <w:hyperlink w:anchor="_Toc241614734" w:history="1">
+          <w:hyperlink w:anchor="_Toc241652120" w:history="1">
             <w:r>
               <w:rPr>
                 <w:rStyle w:val="Hyperlink"/>
@@ -2262,7 +2348,7 @@
               <w:rPr>
                 <w:noProof/>
               </w:rPr>
-              <w:instrText xml:space="preserve"> PAGEREF _Toc241614734 \h </w:instrText>
+              <w:instrText xml:space="preserve"> PAGEREF _Toc241652120 \h </w:instrText>
             </w:r>
             <w:r>
               <w:rPr>
@@ -2304,7 +2390,7 @@
               <w14:ligatures w14:val="standardContextual"/>
             </w:rPr>
           </w:pPr>
-          <w:hyperlink w:anchor="_Toc241614735" w:history="1">
+          <w:hyperlink w:anchor="_Toc241652121" w:history="1">
             <w:r>
               <w:rPr>
                 <w:rStyle w:val="Hyperlink"/>
@@ -2328,7 +2414,7 @@
               <w:rPr>
                 <w:noProof/>
               </w:rPr>
-              <w:instrText xml:space="preserve"> PAGEREF _Toc241614735 \h </w:instrText>
+              <w:instrText xml:space="preserve"> PAGEREF _Toc241652121 \h </w:instrText>
             </w:r>
             <w:r>
               <w:rPr>
@@ -2370,7 +2456,7 @@
               <w14:ligatures w14:val="standardContextual"/>
             </w:rPr>
           </w:pPr>
-          <w:hyperlink w:anchor="_Toc241614736" w:history="1">
+          <w:hyperlink w:anchor="_Toc241652122" w:history="1">
             <w:r>
               <w:rPr>
                 <w:rStyle w:val="Hyperlink"/>
@@ -2394,7 +2480,7 @@
               <w:rPr>
                 <w:noProof/>
               </w:rPr>
-              <w:instrText xml:space="preserve"> PAGEREF _Toc241614736 \h </w:instrText>
+              <w:instrText xml:space="preserve"> PAGEREF _Toc241652122 \h </w:instrText>
             </w:r>
             <w:r>
               <w:rPr>
@@ -2436,7 +2522,7 @@
               <w14:ligatures w14:val="standardContextual"/>
             </w:rPr>
           </w:pPr>
-          <w:hyperlink w:anchor="_Toc241614737" w:history="1">
+          <w:hyperlink w:anchor="_Toc241652123" w:history="1">
             <w:r>
               <w:rPr>
                 <w:rStyle w:val="Hyperlink"/>
@@ -2460,7 +2546,7 @@
               <w:rPr>
                 <w:noProof/>
               </w:rPr>
-              <w:instrText xml:space="preserve"> PAGEREF _Toc241614737 \h </w:instrText>
+              <w:instrText xml:space="preserve"> PAGEREF _Toc241652123 \h </w:instrText>
             </w:r>
             <w:r>
               <w:rPr>
@@ -2502,7 +2588,7 @@
               <w14:ligatures w14:val="standardContextual"/>
             </w:rPr>
           </w:pPr>
-          <w:hyperlink w:anchor="_Toc241614738" w:history="1">
+          <w:hyperlink w:anchor="_Toc241652124" w:history="1">
             <w:r>
               <w:rPr>
                 <w:rStyle w:val="Hyperlink"/>
@@ -2526,7 +2612,7 @@
               <w:rPr>
                 <w:noProof/>
               </w:rPr>
-              <w:instrText xml:space="preserve"> PAGEREF _Toc241614738 \h </w:instrText>
+              <w:instrText xml:space="preserve"> PAGEREF _Toc241652124 \h </w:instrText>
             </w:r>
             <w:r>
               <w:rPr>
@@ -2568,7 +2654,7 @@
               <w14:ligatures w14:val="standardContextual"/>
             </w:rPr>
           </w:pPr>
-          <w:hyperlink w:anchor="_Toc241614739" w:history="1">
+          <w:hyperlink w:anchor="_Toc241652125" w:history="1">
             <w:r>
               <w:rPr>
                 <w:rStyle w:val="Hyperlink"/>
@@ -2592,7 +2678,7 @@
               <w:rPr>
                 <w:noProof/>
               </w:rPr>
-              <w:instrText xml:space="preserve"> PAGEREF _Toc241614739 \h </w:instrText>
+              <w:instrText xml:space="preserve"> PAGEREF _Toc241652125 \h </w:instrText>
             </w:r>
             <w:r>
               <w:rPr>
@@ -2634,7 +2720,7 @@
               <w14:ligatures w14:val="standardContextual"/>
             </w:rPr>
           </w:pPr>
-          <w:hyperlink w:anchor="_Toc241614740" w:history="1">
+          <w:hyperlink w:anchor="_Toc241652126" w:history="1">
             <w:r>
               <w:rPr>
                 <w:rStyle w:val="Hyperlink"/>
@@ -2658,7 +2744,7 @@
               <w:rPr>
                 <w:noProof/>
               </w:rPr>
-              <w:instrText xml:space="preserve"> PAGEREF _Toc241614740 \h </w:instrText>
+              <w:instrText xml:space="preserve"> PAGEREF _Toc241652126 \h </w:instrText>
             </w:r>
             <w:r>
               <w:rPr>
@@ -2700,7 +2786,7 @@
               <w14:ligatures w14:val="standardContextual"/>
             </w:rPr>
           </w:pPr>
-          <w:hyperlink w:anchor="_Toc241614741" w:history="1">
+          <w:hyperlink w:anchor="_Toc241652127" w:history="1">
             <w:r>
               <w:rPr>
                 <w:rStyle w:val="Hyperlink"/>
@@ -2724,7 +2810,7 @@
               <w:rPr>
                 <w:noProof/>
               </w:rPr>
-              <w:instrText xml:space="preserve"> PAGEREF _Toc241614741 \h </w:instrText>
+              <w:instrText xml:space="preserve"> PAGEREF _Toc241652127 \h </w:instrText>
             </w:r>
             <w:r>
               <w:rPr>
@@ -2766,7 +2852,7 @@
               <w14:ligatures w14:val="standardContextual"/>
             </w:rPr>
           </w:pPr>
-          <w:hyperlink w:anchor="_Toc241614742" w:history="1">
+          <w:hyperlink w:anchor="_Toc241652128" w:history="1">
             <w:r>
               <w:rPr>
                 <w:rStyle w:val="Hyperlink"/>
@@ -2790,7 +2876,7 @@
               <w:rPr>
                 <w:noProof/>
               </w:rPr>
-              <w:instrText xml:space="preserve"> PAGEREF _Toc241614742 \h </w:instrText>
+              <w:instrText xml:space="preserve"> PAGEREF _Toc241652128 \h </w:instrText>
             </w:r>
             <w:r>
               <w:rPr>
@@ -2832,7 +2918,7 @@
               <w14:ligatures w14:val="standardContextual"/>
             </w:rPr>
           </w:pPr>
-          <w:hyperlink w:anchor="_Toc241614743" w:history="1">
+          <w:hyperlink w:anchor="_Toc241652129" w:history="1">
             <w:r>
               <w:rPr>
                 <w:rStyle w:val="Hyperlink"/>
@@ -2856,7 +2942,7 @@
               <w:rPr>
                 <w:noProof/>
               </w:rPr>
-              <w:instrText xml:space="preserve"> PAGEREF _Toc241614743 \h </w:instrText>
+              <w:instrText xml:space="preserve"> PAGEREF _Toc241652129 \h </w:instrText>
             </w:r>
             <w:r>
               <w:rPr>
@@ -2898,7 +2984,7 @@
               <w14:ligatures w14:val="standardContextual"/>
             </w:rPr>
           </w:pPr>
-          <w:hyperlink w:anchor="_Toc241614744" w:history="1">
+          <w:hyperlink w:anchor="_Toc241652130" w:history="1">
             <w:r>
               <w:rPr>
                 <w:rStyle w:val="Hyperlink"/>
@@ -2922,7 +3008,7 @@
               <w:rPr>
                 <w:noProof/>
               </w:rPr>
-              <w:instrText xml:space="preserve"> PAGEREF _Toc241614744 \h </w:instrText>
+              <w:instrText xml:space="preserve"> PAGEREF _Toc241652130 \h </w:instrText>
             </w:r>
             <w:r>
               <w:rPr>
@@ -2964,7 +3050,7 @@
               <w14:ligatures w14:val="standardContextual"/>
             </w:rPr>
           </w:pPr>
-          <w:hyperlink w:anchor="_Toc241614745" w:history="1">
+          <w:hyperlink w:anchor="_Toc241652131" w:history="1">
             <w:r>
               <w:rPr>
                 <w:rStyle w:val="Hyperlink"/>
@@ -2988,7 +3074,7 @@
               <w:rPr>
                 <w:noProof/>
               </w:rPr>
-              <w:instrText xml:space="preserve"> PAGEREF _Toc241614745 \h </w:instrText>
+              <w:instrText xml:space="preserve"> PAGEREF _Toc241652131 \h </w:instrText>
             </w:r>
             <w:r>
               <w:rPr>
@@ -3030,7 +3116,7 @@
               <w14:ligatures w14:val="standardContextual"/>
             </w:rPr>
           </w:pPr>
-          <w:hyperlink w:anchor="_Toc241614746" w:history="1">
+          <w:hyperlink w:anchor="_Toc241652132" w:history="1">
             <w:r>
               <w:rPr>
                 <w:rStyle w:val="Hyperlink"/>
@@ -3054,7 +3140,7 @@
               <w:rPr>
                 <w:noProof/>
               </w:rPr>
-              <w:instrText xml:space="preserve"> PAGEREF _Toc241614746 \h </w:instrText>
+              <w:instrText xml:space="preserve"> PAGEREF _Toc241652132 \h </w:instrText>
             </w:r>
             <w:r>
               <w:rPr>
@@ -3096,7 +3182,7 @@
               <w14:ligatures w14:val="standardContextual"/>
             </w:rPr>
           </w:pPr>
-          <w:hyperlink w:anchor="_Toc241614747" w:history="1">
+          <w:hyperlink w:anchor="_Toc241652133" w:history="1">
             <w:r>
               <w:rPr>
                 <w:rStyle w:val="Hyperlink"/>
@@ -3120,7 +3206,7 @@
               <w:rPr>
                 <w:noProof/>
               </w:rPr>
-              <w:instrText xml:space="preserve"> PAGEREF _Toc241614747 \h </w:instrText>
+              <w:instrText xml:space="preserve"> PAGEREF _Toc241652133 \h </w:instrText>
             </w:r>
             <w:r>
               <w:rPr>
@@ -3162,7 +3248,7 @@
               <w14:ligatures w14:val="standardContextual"/>
             </w:rPr>
           </w:pPr>
-          <w:hyperlink w:anchor="_Toc241614748" w:history="1">
+          <w:hyperlink w:anchor="_Toc241652134" w:history="1">
             <w:r>
               <w:rPr>
                 <w:rStyle w:val="Hyperlink"/>
@@ -3186,7 +3272,7 @@
               <w:rPr>
                 <w:noProof/>
               </w:rPr>
-              <w:instrText xml:space="preserve"> PAGEREF _Toc241614748 \h </w:instrText>
+              <w:instrText xml:space="preserve"> PAGEREF _Toc241652134 \h </w:instrText>
             </w:r>
             <w:r>
               <w:rPr>
@@ -3228,7 +3314,7 @@
               <w14:ligatures w14:val="standardContextual"/>
             </w:rPr>
           </w:pPr>
-          <w:hyperlink w:anchor="_Toc241614749" w:history="1">
+          <w:hyperlink w:anchor="_Toc241652135" w:history="1">
             <w:r>
               <w:rPr>
                 <w:rStyle w:val="Hyperlink"/>
@@ -3252,7 +3338,7 @@
               <w:rPr>
                 <w:noProof/>
               </w:rPr>
-              <w:instrText xml:space="preserve"> PAGEREF _Toc241614749 \h </w:instrText>
+              <w:instrText xml:space="preserve"> PAGEREF _Toc241652135 \h </w:instrText>
             </w:r>
             <w:r>
               <w:rPr>
@@ -3294,7 +3380,7 @@
               <w14:ligatures w14:val="standardContextual"/>
             </w:rPr>
           </w:pPr>
-          <w:hyperlink w:anchor="_Toc241614750" w:history="1">
+          <w:hyperlink w:anchor="_Toc241652136" w:history="1">
             <w:r>
               <w:rPr>
                 <w:rStyle w:val="Hyperlink"/>
@@ -3318,7 +3404,7 @@
               <w:rPr>
                 <w:noProof/>
               </w:rPr>
-              <w:instrText xml:space="preserve"> PAGEREF _Toc241614750 \h </w:instrText>
+              <w:instrText xml:space="preserve"> PAGEREF _Toc241652136 \h </w:instrText>
             </w:r>
             <w:r>
               <w:rPr>
@@ -3360,7 +3446,7 @@
               <w14:ligatures w14:val="standardContextual"/>
             </w:rPr>
           </w:pPr>
-          <w:hyperlink w:anchor="_Toc241614751" w:history="1">
+          <w:hyperlink w:anchor="_Toc241652137" w:history="1">
             <w:r>
               <w:rPr>
                 <w:rStyle w:val="Hyperlink"/>
@@ -3384,7 +3470,7 @@
               <w:rPr>
                 <w:noProof/>
               </w:rPr>
-              <w:instrText xml:space="preserve"> PAGEREF _Toc241614751 \h </w:instrText>
+              <w:instrText xml:space="preserve"> PAGEREF _Toc241652137 \h </w:instrText>
             </w:r>
             <w:r>
               <w:rPr>
@@ -3426,7 +3512,7 @@
               <w14:ligatures w14:val="standardContextual"/>
             </w:rPr>
           </w:pPr>
-          <w:hyperlink w:anchor="_Toc241614752" w:history="1">
+          <w:hyperlink w:anchor="_Toc241652138" w:history="1">
             <w:r>
               <w:rPr>
                 <w:rStyle w:val="Hyperlink"/>
@@ -3450,7 +3536,7 @@
               <w:rPr>
                 <w:noProof/>
               </w:rPr>
-              <w:instrText xml:space="preserve"> PAGEREF _Toc241614752 \h </w:instrText>
+              <w:instrText xml:space="preserve"> PAGEREF _Toc241652138 \h </w:instrText>
             </w:r>
             <w:r>
               <w:rPr>
@@ -3492,7 +3578,7 @@
               <w14:ligatures w14:val="standardContextual"/>
             </w:rPr>
           </w:pPr>
-          <w:hyperlink w:anchor="_Toc241614753" w:history="1">
+          <w:hyperlink w:anchor="_Toc241652139" w:history="1">
             <w:r>
               <w:rPr>
                 <w:rStyle w:val="Hyperlink"/>
@@ -3516,7 +3602,7 @@
               <w:rPr>
                 <w:noProof/>
               </w:rPr>
-              <w:instrText xml:space="preserve"> PAGEREF _Toc241614753 \h </w:instrText>
+              <w:instrText xml:space="preserve"> PAGEREF _Toc241652139 \h </w:instrText>
             </w:r>
             <w:r>
               <w:rPr>
@@ -3558,7 +3644,7 @@
               <w14:ligatures w14:val="standardContextual"/>
             </w:rPr>
           </w:pPr>
-          <w:hyperlink w:anchor="_Toc241614754" w:history="1">
+          <w:hyperlink w:anchor="_Toc241652140" w:history="1">
             <w:r>
               <w:rPr>
                 <w:rStyle w:val="Hyperlink"/>
@@ -3582,7 +3668,7 @@
               <w:rPr>
                 <w:noProof/>
               </w:rPr>
-              <w:instrText xml:space="preserve"> PAGEREF _Toc241614754 \h </w:instrText>
+              <w:instrText xml:space="preserve"> PAGEREF _Toc241652140 \h </w:instrText>
             </w:r>
             <w:r>
               <w:rPr>
@@ -3624,7 +3710,7 @@
               <w14:ligatures w14:val="standardContextual"/>
             </w:rPr>
           </w:pPr>
-          <w:hyperlink w:anchor="_Toc241614755" w:history="1">
+          <w:hyperlink w:anchor="_Toc241652141" w:history="1">
             <w:r>
               <w:rPr>
                 <w:rStyle w:val="Hyperlink"/>
@@ -3648,7 +3734,7 @@
               <w:rPr>
                 <w:noProof/>
               </w:rPr>
-              <w:instrText xml:space="preserve"> PAGEREF _Toc241614755 \h </w:instrText>
+              <w:instrText xml:space="preserve"> PAGEREF _Toc241652141 \h </w:instrText>
             </w:r>
             <w:r>
               <w:rPr>
@@ -3690,7 +3776,7 @@
               <w14:ligatures w14:val="standardContextual"/>
             </w:rPr>
           </w:pPr>
-          <w:hyperlink w:anchor="_Toc241614756" w:history="1">
+          <w:hyperlink w:anchor="_Toc241652142" w:history="1">
             <w:r>
               <w:rPr>
                 <w:rStyle w:val="Hyperlink"/>
@@ -3714,7 +3800,7 @@
               <w:rPr>
                 <w:noProof/>
               </w:rPr>
-              <w:instrText xml:space="preserve"> PAGEREF _Toc241614756 \h </w:instrText>
+              <w:instrText xml:space="preserve"> PAGEREF _Toc241652142 \h </w:instrText>
             </w:r>
             <w:r>
               <w:rPr>
@@ -3756,7 +3842,7 @@
               <w14:ligatures w14:val="standardContextual"/>
             </w:rPr>
           </w:pPr>
-          <w:hyperlink w:anchor="_Toc241614757" w:history="1">
+          <w:hyperlink w:anchor="_Toc241652143" w:history="1">
             <w:r>
               <w:rPr>
                 <w:rStyle w:val="Hyperlink"/>
@@ -3780,7 +3866,7 @@
               <w:rPr>
                 <w:noProof/>
               </w:rPr>
-              <w:instrText xml:space="preserve"> PAGEREF _Toc241614757 \h </w:instrText>
+              <w:instrText xml:space="preserve"> PAGEREF _Toc241652143 \h </w:instrText>
             </w:r>
             <w:r>
               <w:rPr>
@@ -3822,7 +3908,7 @@
               <w14:ligatures w14:val="standardContextual"/>
             </w:rPr>
           </w:pPr>
-          <w:hyperlink w:anchor="_Toc241614758" w:history="1">
+          <w:hyperlink w:anchor="_Toc241652144" w:history="1">
             <w:r>
               <w:rPr>
                 <w:rStyle w:val="Hyperlink"/>
@@ -3846,7 +3932,7 @@
               <w:rPr>
                 <w:noProof/>
               </w:rPr>
-              <w:instrText xml:space="preserve"> PAGEREF _Toc241614758 \h </w:instrText>
+              <w:instrText xml:space="preserve"> PAGEREF _Toc241652144 \h </w:instrText>
             </w:r>
             <w:r>
               <w:rPr>
@@ -3888,7 +3974,7 @@
               <w14:ligatures w14:val="standardContextual"/>
             </w:rPr>
           </w:pPr>
-          <w:hyperlink w:anchor="_Toc241614759" w:history="1">
+          <w:hyperlink w:anchor="_Toc241652145" w:history="1">
             <w:r>
               <w:rPr>
                 <w:rStyle w:val="Hyperlink"/>
@@ -3912,7 +3998,7 @@
               <w:rPr>
                 <w:noProof/>
               </w:rPr>
-              <w:instrText xml:space="preserve"> PAGEREF _Toc241614759 \h </w:instrText>
+              <w:instrText xml:space="preserve"> PAGEREF _Toc241652145 \h </w:instrText>
             </w:r>
             <w:r>
               <w:rPr>
@@ -3954,7 +4040,7 @@
               <w14:ligatures w14:val="standardContextual"/>
             </w:rPr>
           </w:pPr>
-          <w:hyperlink w:anchor="_Toc241614760" w:history="1">
+          <w:hyperlink w:anchor="_Toc241652146" w:history="1">
             <w:r>
               <w:rPr>
                 <w:rStyle w:val="Hyperlink"/>
@@ -3978,7 +4064,7 @@
               <w:rPr>
                 <w:noProof/>
               </w:rPr>
-              <w:instrText xml:space="preserve"> PAGEREF _Toc241614760 \h </w:instrText>
+              <w:instrText xml:space="preserve"> PAGEREF _Toc241652146 \h </w:instrText>
             </w:r>
             <w:r>
               <w:rPr>
@@ -4020,7 +4106,7 @@
               <w14:ligatures w14:val="standardContextual"/>
             </w:rPr>
           </w:pPr>
-          <w:hyperlink w:anchor="_Toc241614761" w:history="1">
+          <w:hyperlink w:anchor="_Toc241652147" w:history="1">
             <w:r>
               <w:rPr>
                 <w:rStyle w:val="Hyperlink"/>
@@ -4044,7 +4130,7 @@
               <w:rPr>
                 <w:noProof/>
               </w:rPr>
-              <w:instrText xml:space="preserve"> PAGEREF _Toc241614761 \h </w:instrText>
+              <w:instrText xml:space="preserve"> PAGEREF _Toc241652147 \h </w:instrText>
             </w:r>
             <w:r>
               <w:rPr>
@@ -4086,7 +4172,7 @@
               <w14:ligatures w14:val="standardContextual"/>
             </w:rPr>
           </w:pPr>
-          <w:hyperlink w:anchor="_Toc241614762" w:history="1">
+          <w:hyperlink w:anchor="_Toc241652148" w:history="1">
             <w:r>
               <w:rPr>
                 <w:rStyle w:val="Hyperlink"/>
@@ -4110,7 +4196,7 @@
               <w:rPr>
                 <w:noProof/>
               </w:rPr>
-              <w:instrText xml:space="preserve"> PAGEREF _Toc241614762 \h </w:instrText>
+              <w:instrText xml:space="preserve"> PAGEREF _Toc241652148 \h </w:instrText>
             </w:r>
             <w:r>
               <w:rPr>
@@ -4152,7 +4238,7 @@
               <w14:ligatures w14:val="standardContextual"/>
             </w:rPr>
           </w:pPr>
-          <w:hyperlink w:anchor="_Toc241614763" w:history="1">
+          <w:hyperlink w:anchor="_Toc241652149" w:history="1">
             <w:r>
               <w:rPr>
                 <w:rStyle w:val="Hyperlink"/>
@@ -4176,7 +4262,7 @@
               <w:rPr>
                 <w:noProof/>
               </w:rPr>
-              <w:instrText xml:space="preserve"> PAGEREF _Toc241614763 \h </w:instrText>
+              <w:instrText xml:space="preserve"> PAGEREF _Toc241652149 \h </w:instrText>
             </w:r>
             <w:r>
               <w:rPr>
@@ -4230,7 +4316,7 @@
         <w:pStyle w:val="Heading1"/>
         <w:pageBreakBefore/>
       </w:pPr>
-      <w:bookmarkStart w:id="1" w:name="_Toc241614716"/>
+      <w:bookmarkStart w:id="1" w:name="_Toc241652102"/>
       <w:r>
         <w:lastRenderedPageBreak/>
         <w:t>1. Pengenalan SmartGate Fusion4</w:t>
@@ -4241,7 +4327,7 @@
       <w:pPr>
         <w:pStyle w:val="Heading2"/>
       </w:pPr>
-      <w:bookmarkStart w:id="2" w:name="_Toc241614717"/>
+      <w:bookmarkStart w:id="2" w:name="_Toc241652103"/>
       <w:r>
         <w:t>1.1 Tujuan</w:t>
       </w:r>
@@ -4259,7 +4345,7 @@
       <w:pPr>
         <w:pStyle w:val="Heading2"/>
       </w:pPr>
-      <w:bookmarkStart w:id="3" w:name="_Toc241614718"/>
+      <w:bookmarkStart w:id="3" w:name="_Toc241652104"/>
       <w:r>
         <w:t>1.2 Aplikasi dalam ekosistem</w:t>
       </w:r>
@@ -4280,7 +4366,7 @@
           <w:left w:w="10" w:type="dxa"/>
           <w:right w:w="10" w:type="dxa"/>
         </w:tblCellMar>
-        <w:tblLook w:val="04A0" w:firstRow="1" w:lastRow="0" w:firstColumn="1" w:lastColumn="0" w:noHBand="0" w:noVBand="1"/>
+        <w:tblLook w:val="0000" w:firstRow="0" w:lastRow="0" w:firstColumn="0" w:lastColumn="0" w:noHBand="0" w:noVBand="0"/>
       </w:tblPr>
       <w:tblGrid>
         <w:gridCol w:w="3300"/>
@@ -5214,7 +5300,7 @@
       <w:pPr>
         <w:pStyle w:val="Heading2"/>
       </w:pPr>
-      <w:bookmarkStart w:id="4" w:name="_Toc241614719"/>
+      <w:bookmarkStart w:id="4" w:name="_Toc241652105"/>
       <w:r>
         <w:t>1.3 Data &amp; keamanan</w:t>
       </w:r>
@@ -5274,7 +5360,7 @@
         <w:pStyle w:val="Heading1"/>
         <w:pageBreakBefore/>
       </w:pPr>
-      <w:bookmarkStart w:id="5" w:name="_Toc241614720"/>
+      <w:bookmarkStart w:id="5" w:name="_Toc241652106"/>
       <w:r>
         <w:lastRenderedPageBreak/>
         <w:t>2. Akun &amp; Hak Akses</w:t>
@@ -5285,7 +5371,7 @@
       <w:pPr>
         <w:pStyle w:val="Heading2"/>
       </w:pPr>
-      <w:bookmarkStart w:id="6" w:name="_Toc241614721"/>
+      <w:bookmarkStart w:id="6" w:name="_Toc241652107"/>
       <w:r>
         <w:t>2.1 Dua kolom hak akses</w:t>
       </w:r>
@@ -5371,7 +5457,7 @@
       <w:pPr>
         <w:pStyle w:val="Heading2"/>
       </w:pPr>
-      <w:bookmarkStart w:id="7" w:name="_Toc241614722"/>
+      <w:bookmarkStart w:id="7" w:name="_Toc241652108"/>
       <w:r>
         <w:t>2.2 Kode PIC (menu Admin Portal)</w:t>
       </w:r>
@@ -5392,7 +5478,7 @@
           <w:left w:w="10" w:type="dxa"/>
           <w:right w:w="10" w:type="dxa"/>
         </w:tblCellMar>
-        <w:tblLook w:val="04A0" w:firstRow="1" w:lastRow="0" w:firstColumn="1" w:lastColumn="0" w:noHBand="0" w:noVBand="1"/>
+        <w:tblLook w:val="0000" w:firstRow="0" w:lastRow="0" w:firstColumn="0" w:lastColumn="0" w:noHBand="0" w:noVBand="0"/>
       </w:tblPr>
       <w:tblGrid>
         <w:gridCol w:w="2200"/>
@@ -6142,7 +6228,7 @@
       <w:pPr>
         <w:pStyle w:val="Heading2"/>
       </w:pPr>
-      <w:bookmarkStart w:id="8" w:name="_Toc241614723"/>
+      <w:bookmarkStart w:id="8" w:name="_Toc241652109"/>
       <w:r>
         <w:t>2.3 Kode Author (hak persetujuan)</w:t>
       </w:r>
@@ -6163,7 +6249,7 @@
           <w:left w:w="10" w:type="dxa"/>
           <w:right w:w="10" w:type="dxa"/>
         </w:tblCellMar>
-        <w:tblLook w:val="04A0" w:firstRow="1" w:lastRow="0" w:firstColumn="1" w:lastColumn="0" w:noHBand="0" w:noVBand="1"/>
+        <w:tblLook w:val="0000" w:firstRow="0" w:lastRow="0" w:firstColumn="0" w:lastColumn="0" w:noHBand="0" w:noVBand="0"/>
       </w:tblPr>
       <w:tblGrid>
         <w:gridCol w:w="3200"/>
@@ -6553,7 +6639,7 @@
       <w:pPr>
         <w:pStyle w:val="Heading2"/>
       </w:pPr>
-      <w:bookmarkStart w:id="9" w:name="_Toc241614724"/>
+      <w:bookmarkStart w:id="9" w:name="_Toc241652110"/>
       <w:r>
         <w:t>2.4 Rantai atasan ("Diotorisasi Oleh")</w:t>
       </w:r>
@@ -6582,7 +6668,7 @@
         <w:pStyle w:val="Heading1"/>
         <w:pageBreakBefore/>
       </w:pPr>
-      <w:bookmarkStart w:id="10" w:name="_Toc241614725"/>
+      <w:bookmarkStart w:id="10" w:name="_Toc241652111"/>
       <w:r>
         <w:lastRenderedPageBreak/>
         <w:t>3. Digital Badge &amp; Pendaftaran Wajah</w:t>
@@ -6593,7 +6679,7 @@
       <w:pPr>
         <w:pStyle w:val="Heading2"/>
       </w:pPr>
-      <w:bookmarkStart w:id="11" w:name="_Toc241614726"/>
+      <w:bookmarkStart w:id="11" w:name="_Toc241652112"/>
       <w:r>
         <w:t>3.1 Aktivasi karyawan baru</w:t>
       </w:r>
@@ -6705,7 +6791,7 @@
       <w:pPr>
         <w:pStyle w:val="Heading2"/>
       </w:pPr>
-      <w:bookmarkStart w:id="12" w:name="_Toc241614727"/>
+      <w:bookmarkStart w:id="12" w:name="_Toc241652113"/>
       <w:r>
         <w:t>3.2 Isi Digital Badge</w:t>
       </w:r>
@@ -6877,7 +6963,7 @@
       <w:pPr>
         <w:pStyle w:val="Heading2"/>
       </w:pPr>
-      <w:bookmarkStart w:id="13" w:name="_Toc241614728"/>
+      <w:bookmarkStart w:id="13" w:name="_Toc241652114"/>
       <w:r>
         <w:t>3.3 Slip gaji di Digital Badge</w:t>
       </w:r>
@@ -7046,7 +7132,7 @@
         <w:pStyle w:val="Heading1"/>
         <w:pageBreakBefore/>
       </w:pPr>
-      <w:bookmarkStart w:id="14" w:name="_Toc241614729"/>
+      <w:bookmarkStart w:id="14" w:name="_Toc241652115"/>
       <w:r>
         <w:lastRenderedPageBreak/>
         <w:t>4. Presensi Harian</w:t>
@@ -7057,7 +7143,7 @@
       <w:pPr>
         <w:pStyle w:val="Heading2"/>
       </w:pPr>
-      <w:bookmarkStart w:id="15" w:name="_Toc241614730"/>
+      <w:bookmarkStart w:id="15" w:name="_Toc241652116"/>
       <w:r>
         <w:t>4.1 Alur scan</w:t>
       </w:r>
@@ -7106,7 +7192,7 @@
       <w:pPr>
         <w:pStyle w:val="Heading2"/>
       </w:pPr>
-      <w:bookmarkStart w:id="16" w:name="_Toc241614731"/>
+      <w:bookmarkStart w:id="16" w:name="_Toc241652117"/>
       <w:r>
         <w:t>4.2 Slot waktu (default, bisa diatur per lokasi)</w:t>
       </w:r>
@@ -7127,7 +7213,7 @@
           <w:left w:w="10" w:type="dxa"/>
           <w:right w:w="10" w:type="dxa"/>
         </w:tblCellMar>
-        <w:tblLook w:val="04A0" w:firstRow="1" w:lastRow="0" w:firstColumn="1" w:lastColumn="0" w:noHBand="0" w:noVBand="1"/>
+        <w:tblLook w:val="0000" w:firstRow="0" w:lastRow="0" w:firstColumn="0" w:lastColumn="0" w:noHBand="0" w:noVBand="0"/>
       </w:tblPr>
       <w:tblGrid>
         <w:gridCol w:w="1800"/>
@@ -7751,7 +7837,7 @@
       <w:pPr>
         <w:pStyle w:val="Heading2"/>
       </w:pPr>
-      <w:bookmarkStart w:id="17" w:name="_Toc241614732"/>
+      <w:bookmarkStart w:id="17" w:name="_Toc241652118"/>
       <w:r>
         <w:t>4.3 Absen Offline (site blank spot)</w:t>
       </w:r>
@@ -7772,7 +7858,17 @@
         <w:t>HP pribadinya</w:t>
       </w:r>
       <w:r>
-        <w:t>. Data disimpan di HP, lalu dikirim otomatis ke server begitu ada sinyal. Absen offline hanya untuk HP milik karyawan sendiri: HP hanya menyimpan wajah pemiliknya, bukan wajah orang lain.</w:t>
+        <w:t xml:space="preserve">. Data disimpan di HP, lalu dikirim otomatis ke server begitu ada sinyal. HP hanya menyimpan wajah orang yang </w:t>
+      </w:r>
+      <w:r>
+        <w:rPr>
+          <w:b/>
+          <w:bCs/>
+        </w:rPr>
+        <w:t>login Digital Badge-nya sendiri</w:t>
+      </w:r>
+      <w:r>
+        <w:t xml:space="preserve"> di HP itu.</w:t>
       </w:r>
     </w:p>
     <w:p>
@@ -7905,7 +8001,25 @@
         <w:pStyle w:val="Heading3"/>
       </w:pPr>
       <w:r>
-        <w:t>Absen tanpa sinyal</w:t>
+        <w:t>Titip di HP teman (tidak punya HP / HP ketinggalan)</w:t>
+      </w:r>
+    </w:p>
+    <w:p>
+      <w:pPr>
+        <w:spacing w:after="120" w:line="276" w:lineRule="auto"/>
+      </w:pPr>
+      <w:r>
+        <w:t xml:space="preserve">Satu HP bisa menyimpan </w:t>
+      </w:r>
+      <w:r>
+        <w:rPr>
+          <w:b/>
+          <w:bCs/>
+        </w:rPr>
+        <w:t>maksimal 5 orang</w:t>
+      </w:r>
+      <w:r>
+        <w:t>: pemilik HP + teman satu regu yang menitip.</w:t>
       </w:r>
     </w:p>
     <w:p>
@@ -7918,34 +8032,17 @@
         <w:spacing w:after="60" w:line="276" w:lineRule="auto"/>
       </w:pPr>
       <w:r>
-        <w:t xml:space="preserve">Buka </w:t>
+        <w:t xml:space="preserve">Saat masih ada sinyal, karyawan yang menitip login </w:t>
       </w:r>
       <w:r>
         <w:rPr>
           <w:b/>
           <w:bCs/>
         </w:rPr>
-        <w:t>Digital Badge</w:t>
-      </w:r>
-      <w:r>
-        <w:t xml:space="preserve"> (masukkan PIN seperti biasa). Muncul banner </w:t>
-      </w:r>
-      <w:r>
-        <w:rPr>
-          <w:b/>
-          <w:bCs/>
-        </w:rPr>
-        <w:t>📴</w:t>
-      </w:r>
-      <w:r>
-        <w:rPr>
-          <w:b/>
-          <w:bCs/>
-        </w:rPr>
-        <w:t xml:space="preserve"> Mode Offline</w:t>
-      </w:r>
-      <w:r>
-        <w:t>: hanya tombol ABSEN yang aktif.</w:t>
+        <w:t>Digital Badge-nya sendiri (PIN sendiri)</w:t>
+      </w:r>
+      <w:r>
+        <w:t xml:space="preserve"> di HP teman, sampai muncul ✅ Siap Offline.</w:t>
       </w:r>
     </w:p>
     <w:p>
@@ -7958,17 +8055,17 @@
         <w:spacing w:after="60" w:line="276" w:lineRule="auto"/>
       </w:pPr>
       <w:r>
-        <w:t xml:space="preserve">Tekan </w:t>
+        <w:t xml:space="preserve">Di bawah tombol ABSEN muncul daftar </w:t>
       </w:r>
       <w:r>
         <w:rPr>
           <w:b/>
           <w:bCs/>
         </w:rPr>
-        <w:t>ABSEN</w:t>
-      </w:r>
-      <w:r>
-        <w:t>. HP mengecek GPS terhadap daftar lokasi yang tersimpan, jadi harus tetap di dalam radius.</w:t>
+        <w:t>Tersimpan di HP ini (n/5)</w:t>
+      </w:r>
+      <w:r>
+        <w:t>. Pemilik HP ditandai *(pemilik HP)*.</w:t>
       </w:r>
     </w:p>
     <w:p>
@@ -7982,6 +8079,195 @@
       </w:pPr>
       <w:r>
         <w:lastRenderedPageBreak/>
+        <w:t xml:space="preserve">Di site, buka Digital Badge di HP itu dengan </w:t>
+      </w:r>
+      <w:r>
+        <w:rPr>
+          <w:b/>
+          <w:bCs/>
+        </w:rPr>
+        <w:t>PIN masing-masing</w:t>
+      </w:r>
+      <w:r>
+        <w:t>, lalu ABSEN. Wajah tetap dicocokkan ke pemilik PIN, jadi titip absen (orang lain yang scan) tetap ditolak.</w:t>
+      </w:r>
+    </w:p>
+    <w:p>
+      <w:pPr>
+        <w:pStyle w:val="ListParagraph"/>
+        <w:numPr>
+          <w:ilvl w:val="0"/>
+          <w:numId w:val="2"/>
+        </w:numPr>
+        <w:spacing w:after="60" w:line="276" w:lineRule="auto"/>
+      </w:pPr>
+      <w:r>
+        <w:t>Data titipan tetap tersimpan walau orangnya kemudian absen di HP sendiri, jadi bisa dipakai lagi kalau HP-nya ketinggalan.</w:t>
+      </w:r>
+    </w:p>
+    <w:p>
+      <w:pPr>
+        <w:pStyle w:val="ListParagraph"/>
+        <w:numPr>
+          <w:ilvl w:val="0"/>
+          <w:numId w:val="2"/>
+        </w:numPr>
+        <w:spacing w:after="60" w:line="276" w:lineRule="auto"/>
+      </w:pPr>
+      <w:r>
+        <w:t xml:space="preserve">Setiap HP itu membuka Badge saat online, </w:t>
+      </w:r>
+      <w:r>
+        <w:rPr>
+          <w:b/>
+          <w:bCs/>
+        </w:rPr>
+        <w:t>semua</w:t>
+      </w:r>
+      <w:r>
+        <w:t xml:space="preserve"> data titipan ikut diperbarui otomatis (wajah hasil enroll ulang, lokasi baru). Karyawan yang sudah nonaktif/resign otomatis terhapus.</w:t>
+      </w:r>
+    </w:p>
+    <w:p>
+      <w:pPr>
+        <w:pStyle w:val="ListParagraph"/>
+        <w:numPr>
+          <w:ilvl w:val="0"/>
+          <w:numId w:val="2"/>
+        </w:numPr>
+        <w:spacing w:after="60" w:line="276" w:lineRule="auto"/>
+      </w:pPr>
+      <w:r>
+        <w:t xml:space="preserve">Titipan yang </w:t>
+      </w:r>
+      <w:r>
+        <w:rPr>
+          <w:b/>
+          <w:bCs/>
+        </w:rPr>
+        <w:t>30 hari tidak dipakai</w:t>
+      </w:r>
+      <w:r>
+        <w:t xml:space="preserve"> di HP itu terhapus otomatis. Data pemilik HP tidak ikut terhapus.</w:t>
+      </w:r>
+    </w:p>
+    <w:p>
+      <w:pPr>
+        <w:pStyle w:val="ListParagraph"/>
+        <w:numPr>
+          <w:ilvl w:val="0"/>
+          <w:numId w:val="2"/>
+        </w:numPr>
+        <w:spacing w:after="60" w:line="276" w:lineRule="auto"/>
+      </w:pPr>
+      <w:r>
+        <w:t>Kalau ganti PIN, login sekali lagi di HP teman saat ada sinyal (atau pakai PIN lama di HP itu).</w:t>
+      </w:r>
+    </w:p>
+    <w:p>
+      <w:pPr>
+        <w:pStyle w:val="ListParagraph"/>
+        <w:numPr>
+          <w:ilvl w:val="0"/>
+          <w:numId w:val="2"/>
+        </w:numPr>
+        <w:spacing w:after="60" w:line="276" w:lineRule="auto"/>
+      </w:pPr>
+      <w:r>
+        <w:t xml:space="preserve">Link </w:t>
+      </w:r>
+      <w:r>
+        <w:rPr>
+          <w:b/>
+          <w:bCs/>
+        </w:rPr>
+        <w:t>hapus</w:t>
+      </w:r>
+      <w:r>
+        <w:t xml:space="preserve"> di daftar untuk mengeluarkan seseorang dari HP (mis. HP penuh 5 orang).</w:t>
+      </w:r>
+    </w:p>
+    <w:p>
+      <w:pPr>
+        <w:pStyle w:val="Heading3"/>
+      </w:pPr>
+      <w:r>
+        <w:t>Absen tanpa sinyal</w:t>
+      </w:r>
+    </w:p>
+    <w:p>
+      <w:pPr>
+        <w:pStyle w:val="ListParagraph"/>
+        <w:numPr>
+          <w:ilvl w:val="0"/>
+          <w:numId w:val="7"/>
+        </w:numPr>
+        <w:spacing w:after="60" w:line="276" w:lineRule="auto"/>
+      </w:pPr>
+      <w:r>
+        <w:t xml:space="preserve">Buka </w:t>
+      </w:r>
+      <w:r>
+        <w:rPr>
+          <w:b/>
+          <w:bCs/>
+        </w:rPr>
+        <w:t>Digital Badge</w:t>
+      </w:r>
+      <w:r>
+        <w:t xml:space="preserve"> (masukkan PIN seperti biasa). Muncul banner </w:t>
+      </w:r>
+      <w:r>
+        <w:rPr>
+          <w:b/>
+          <w:bCs/>
+        </w:rPr>
+        <w:t>📴</w:t>
+      </w:r>
+      <w:r>
+        <w:rPr>
+          <w:b/>
+          <w:bCs/>
+        </w:rPr>
+        <w:t xml:space="preserve"> Mode Offline</w:t>
+      </w:r>
+      <w:r>
+        <w:t>: hanya tombol ABSEN yang aktif.</w:t>
+      </w:r>
+    </w:p>
+    <w:p>
+      <w:pPr>
+        <w:pStyle w:val="ListParagraph"/>
+        <w:numPr>
+          <w:ilvl w:val="0"/>
+          <w:numId w:val="7"/>
+        </w:numPr>
+        <w:spacing w:after="60" w:line="276" w:lineRule="auto"/>
+      </w:pPr>
+      <w:r>
+        <w:t xml:space="preserve">Tekan </w:t>
+      </w:r>
+      <w:r>
+        <w:rPr>
+          <w:b/>
+          <w:bCs/>
+        </w:rPr>
+        <w:t>ABSEN</w:t>
+      </w:r>
+      <w:r>
+        <w:t>. HP mengecek GPS terhadap daftar lokasi yang tersimpan, jadi harus tetap di dalam radius.</w:t>
+      </w:r>
+    </w:p>
+    <w:p>
+      <w:pPr>
+        <w:pStyle w:val="ListParagraph"/>
+        <w:numPr>
+          <w:ilvl w:val="0"/>
+          <w:numId w:val="7"/>
+        </w:numPr>
+        <w:spacing w:after="60" w:line="276" w:lineRule="auto"/>
+      </w:pPr>
+      <w:r>
         <w:t xml:space="preserve">Scan wajah. Kalau cocok, muncul </w:t>
       </w:r>
       <w:r>
@@ -8162,7 +8448,7 @@
           <w:left w:w="10" w:type="dxa"/>
           <w:right w:w="10" w:type="dxa"/>
         </w:tblCellMar>
-        <w:tblLook w:val="04A0" w:firstRow="1" w:lastRow="0" w:firstColumn="1" w:lastColumn="0" w:noHBand="0" w:noVBand="1"/>
+        <w:tblLook w:val="0000" w:firstRow="0" w:lastRow="0" w:firstColumn="0" w:lastColumn="0" w:noHBand="0" w:noVBand="0"/>
       </w:tblPr>
       <w:tblGrid>
         <w:gridCol w:w="4000"/>
@@ -8607,7 +8893,7 @@
         <w:pStyle w:val="Heading1"/>
         <w:pageBreakBefore/>
       </w:pPr>
-      <w:bookmarkStart w:id="18" w:name="_Toc241614733"/>
+      <w:bookmarkStart w:id="18" w:name="_Toc241652119"/>
       <w:r>
         <w:lastRenderedPageBreak/>
         <w:t>5. Pengajuan &amp; Approval (Ijin, Lembur, Cuti, Off)</w:t>
@@ -8618,7 +8904,7 @@
       <w:pPr>
         <w:pStyle w:val="Heading2"/>
       </w:pPr>
-      <w:bookmarkStart w:id="19" w:name="_Toc241614734"/>
+      <w:bookmarkStart w:id="19" w:name="_Toc241652120"/>
       <w:r>
         <w:t>5.1 Alur approval — berlaku untuk semua jenis</w:t>
       </w:r>
@@ -8639,7 +8925,7 @@
           <w:left w:w="10" w:type="dxa"/>
           <w:right w:w="10" w:type="dxa"/>
         </w:tblCellMar>
-        <w:tblLook w:val="04A0" w:firstRow="1" w:lastRow="0" w:firstColumn="1" w:lastColumn="0" w:noHBand="0" w:noVBand="1"/>
+        <w:tblLook w:val="0000" w:firstRow="0" w:lastRow="0" w:firstColumn="0" w:lastColumn="0" w:noHBand="0" w:noVBand="0"/>
       </w:tblPr>
       <w:tblGrid>
         <w:gridCol w:w="1700"/>
@@ -9361,7 +9647,7 @@
       <w:pPr>
         <w:pStyle w:val="Heading2"/>
       </w:pPr>
-      <w:bookmarkStart w:id="20" w:name="_Toc241614735"/>
+      <w:bookmarkStart w:id="20" w:name="_Toc241652121"/>
       <w:r>
         <w:t>5.2 Ijin</w:t>
       </w:r>
@@ -9400,7 +9686,7 @@
           <w:left w:w="10" w:type="dxa"/>
           <w:right w:w="10" w:type="dxa"/>
         </w:tblCellMar>
-        <w:tblLook w:val="04A0" w:firstRow="1" w:lastRow="0" w:firstColumn="1" w:lastColumn="0" w:noHBand="0" w:noVBand="1"/>
+        <w:tblLook w:val="0000" w:firstRow="0" w:lastRow="0" w:firstColumn="0" w:lastColumn="0" w:noHBand="0" w:noVBand="0"/>
       </w:tblPr>
       <w:tblGrid>
         <w:gridCol w:w="6000"/>
@@ -9862,7 +10148,7 @@
       <w:pPr>
         <w:pStyle w:val="Heading2"/>
       </w:pPr>
-      <w:bookmarkStart w:id="21" w:name="_Toc241614736"/>
+      <w:bookmarkStart w:id="21" w:name="_Toc241652122"/>
       <w:r>
         <w:t>5.3 Lembur (SPKL)</w:t>
       </w:r>
@@ -9921,7 +10207,7 @@
       <w:pPr>
         <w:pStyle w:val="Heading2"/>
       </w:pPr>
-      <w:bookmarkStart w:id="22" w:name="_Toc241614737"/>
+      <w:bookmarkStart w:id="22" w:name="_Toc241652123"/>
       <w:r>
         <w:lastRenderedPageBreak/>
         <w:t>5.4 Cuti</w:t>
@@ -9943,7 +10229,7 @@
           <w:left w:w="10" w:type="dxa"/>
           <w:right w:w="10" w:type="dxa"/>
         </w:tblCellMar>
-        <w:tblLook w:val="04A0" w:firstRow="1" w:lastRow="0" w:firstColumn="1" w:lastColumn="0" w:noHBand="0" w:noVBand="1"/>
+        <w:tblLook w:val="0000" w:firstRow="0" w:lastRow="0" w:firstColumn="0" w:lastColumn="0" w:noHBand="0" w:noVBand="0"/>
       </w:tblPr>
       <w:tblGrid>
         <w:gridCol w:w="6000"/>
@@ -10165,7 +10451,7 @@
       <w:pPr>
         <w:pStyle w:val="Heading2"/>
       </w:pPr>
-      <w:bookmarkStart w:id="23" w:name="_Toc241614738"/>
+      <w:bookmarkStart w:id="23" w:name="_Toc241652124"/>
       <w:r>
         <w:t>5.5 Off — Off Rotasi &amp; Off Periode</w:t>
       </w:r>
@@ -10186,7 +10472,7 @@
           <w:left w:w="10" w:type="dxa"/>
           <w:right w:w="10" w:type="dxa"/>
         </w:tblCellMar>
-        <w:tblLook w:val="04A0" w:firstRow="1" w:lastRow="0" w:firstColumn="1" w:lastColumn="0" w:noHBand="0" w:noVBand="1"/>
+        <w:tblLook w:val="0000" w:firstRow="0" w:lastRow="0" w:firstColumn="0" w:lastColumn="0" w:noHBand="0" w:noVBand="0"/>
       </w:tblPr>
       <w:tblGrid>
         <w:gridCol w:w="1700"/>
@@ -10792,7 +11078,7 @@
       <w:pPr>
         <w:pStyle w:val="Heading2"/>
       </w:pPr>
-      <w:bookmarkStart w:id="24" w:name="_Toc241614739"/>
+      <w:bookmarkStart w:id="24" w:name="_Toc241652125"/>
       <w:r>
         <w:t>5.6 Hak &amp; jatah Off (diatur per Pola Kerja)</w:t>
       </w:r>
@@ -10871,7 +11157,7 @@
           <w:left w:w="10" w:type="dxa"/>
           <w:right w:w="10" w:type="dxa"/>
         </w:tblCellMar>
-        <w:tblLook w:val="04A0" w:firstRow="1" w:lastRow="0" w:firstColumn="1" w:lastColumn="0" w:noHBand="0" w:noVBand="1"/>
+        <w:tblLook w:val="0000" w:firstRow="0" w:lastRow="0" w:firstColumn="0" w:lastColumn="0" w:noHBand="0" w:noVBand="0"/>
       </w:tblPr>
       <w:tblGrid>
         <w:gridCol w:w="4238"/>
@@ -11633,7 +11919,7 @@
       <w:pPr>
         <w:pStyle w:val="Heading2"/>
       </w:pPr>
-      <w:bookmarkStart w:id="25" w:name="_Toc241614740"/>
+      <w:bookmarkStart w:id="25" w:name="_Toc241652126"/>
       <w:r>
         <w:t>5.7 Ubah tanggal oleh approver (Cuti &amp; Off)</w:t>
       </w:r>
@@ -11644,7 +11930,7 @@
         <w:pStyle w:val="ListParagraph"/>
         <w:numPr>
           <w:ilvl w:val="0"/>
-          <w:numId w:val="7"/>
+          <w:numId w:val="8"/>
         </w:numPr>
         <w:spacing w:after="60" w:line="276" w:lineRule="auto"/>
       </w:pPr>
@@ -11681,7 +11967,7 @@
         <w:pStyle w:val="ListParagraph"/>
         <w:numPr>
           <w:ilvl w:val="0"/>
-          <w:numId w:val="7"/>
+          <w:numId w:val="8"/>
         </w:numPr>
         <w:spacing w:after="60" w:line="276" w:lineRule="auto"/>
       </w:pPr>
@@ -11704,7 +11990,7 @@
         <w:pStyle w:val="ListParagraph"/>
         <w:numPr>
           <w:ilvl w:val="0"/>
-          <w:numId w:val="7"/>
+          <w:numId w:val="8"/>
         </w:numPr>
         <w:spacing w:after="60" w:line="276" w:lineRule="auto"/>
       </w:pPr>
@@ -11717,7 +12003,7 @@
         <w:pStyle w:val="ListParagraph"/>
         <w:numPr>
           <w:ilvl w:val="0"/>
-          <w:numId w:val="7"/>
+          <w:numId w:val="8"/>
         </w:numPr>
         <w:spacing w:after="60" w:line="276" w:lineRule="auto"/>
       </w:pPr>
@@ -11730,7 +12016,7 @@
         <w:pStyle w:val="Heading1"/>
         <w:pageBreakBefore/>
       </w:pPr>
-      <w:bookmarkStart w:id="26" w:name="_Toc241614741"/>
+      <w:bookmarkStart w:id="26" w:name="_Toc241652127"/>
       <w:r>
         <w:lastRenderedPageBreak/>
         <w:t>6. Monitoring &amp; Layar TV</w:t>
@@ -11741,7 +12027,7 @@
       <w:pPr>
         <w:pStyle w:val="Heading2"/>
       </w:pPr>
-      <w:bookmarkStart w:id="27" w:name="_Toc241614742"/>
+      <w:bookmarkStart w:id="27" w:name="_Toc241652128"/>
       <w:r>
         <w:t>6.1 Monitoring Attendance &amp; Enroll (MAE)</w:t>
       </w:r>
@@ -11877,7 +12163,7 @@
         <w:pStyle w:val="ListParagraph"/>
         <w:numPr>
           <w:ilvl w:val="0"/>
-          <w:numId w:val="8"/>
+          <w:numId w:val="9"/>
         </w:numPr>
         <w:spacing w:after="60" w:line="276" w:lineRule="auto"/>
       </w:pPr>
@@ -11917,7 +12203,7 @@
         <w:pStyle w:val="ListParagraph"/>
         <w:numPr>
           <w:ilvl w:val="0"/>
-          <w:numId w:val="8"/>
+          <w:numId w:val="9"/>
         </w:numPr>
         <w:spacing w:after="60" w:line="276" w:lineRule="auto"/>
       </w:pPr>
@@ -11930,7 +12216,7 @@
         <w:pStyle w:val="ListParagraph"/>
         <w:numPr>
           <w:ilvl w:val="0"/>
-          <w:numId w:val="8"/>
+          <w:numId w:val="9"/>
         </w:numPr>
         <w:spacing w:after="60" w:line="276" w:lineRule="auto"/>
       </w:pPr>
@@ -11989,7 +12275,7 @@
       <w:pPr>
         <w:pStyle w:val="Heading2"/>
       </w:pPr>
-      <w:bookmarkStart w:id="28" w:name="_Toc241614743"/>
+      <w:bookmarkStart w:id="28" w:name="_Toc241652129"/>
       <w:r>
         <w:t>6.2 Layar TV Attendance</w:t>
       </w:r>
@@ -12048,7 +12334,7 @@
           <w:left w:w="10" w:type="dxa"/>
           <w:right w:w="10" w:type="dxa"/>
         </w:tblCellMar>
-        <w:tblLook w:val="04A0" w:firstRow="1" w:lastRow="0" w:firstColumn="1" w:lastColumn="0" w:noHBand="0" w:noVBand="1"/>
+        <w:tblLook w:val="0000" w:firstRow="0" w:lastRow="0" w:firstColumn="0" w:lastColumn="0" w:noHBand="0" w:noVBand="0"/>
       </w:tblPr>
       <w:tblGrid>
         <w:gridCol w:w="2600"/>
@@ -12307,7 +12593,7 @@
         <w:pStyle w:val="Heading1"/>
         <w:pageBreakBefore/>
       </w:pPr>
-      <w:bookmarkStart w:id="29" w:name="_Toc241614744"/>
+      <w:bookmarkStart w:id="29" w:name="_Toc241652130"/>
       <w:r>
         <w:lastRenderedPageBreak/>
         <w:t>7. Permintaan Karyawan &amp; Rekrutmen</w:t>
@@ -12318,7 +12604,7 @@
       <w:pPr>
         <w:pStyle w:val="Heading2"/>
       </w:pPr>
-      <w:bookmarkStart w:id="30" w:name="_Toc241614745"/>
+      <w:bookmarkStart w:id="30" w:name="_Toc241652131"/>
       <w:r>
         <w:t>7.1 Alur</w:t>
       </w:r>
@@ -12339,7 +12625,7 @@
           <w:left w:w="10" w:type="dxa"/>
           <w:right w:w="10" w:type="dxa"/>
         </w:tblCellMar>
-        <w:tblLook w:val="04A0" w:firstRow="1" w:lastRow="0" w:firstColumn="1" w:lastColumn="0" w:noHBand="0" w:noVBand="1"/>
+        <w:tblLook w:val="0000" w:firstRow="0" w:lastRow="0" w:firstColumn="0" w:lastColumn="0" w:noHBand="0" w:noVBand="0"/>
       </w:tblPr>
       <w:tblGrid>
         <w:gridCol w:w="900"/>
@@ -13104,7 +13390,7 @@
         <w:pStyle w:val="Heading1"/>
         <w:pageBreakBefore/>
       </w:pPr>
-      <w:bookmarkStart w:id="31" w:name="_Toc241614746"/>
+      <w:bookmarkStart w:id="31" w:name="_Toc241652132"/>
       <w:r>
         <w:lastRenderedPageBreak/>
         <w:t>8. Kontrak Karyawan</w:t>
@@ -13115,7 +13401,7 @@
       <w:pPr>
         <w:pStyle w:val="Heading2"/>
       </w:pPr>
-      <w:bookmarkStart w:id="32" w:name="_Toc241614747"/>
+      <w:bookmarkStart w:id="32" w:name="_Toc241652133"/>
       <w:r>
         <w:t>8.1 Mengisi kontrak</w:t>
       </w:r>
@@ -13136,7 +13422,7 @@
           <w:left w:w="10" w:type="dxa"/>
           <w:right w:w="10" w:type="dxa"/>
         </w:tblCellMar>
-        <w:tblLook w:val="04A0" w:firstRow="1" w:lastRow="0" w:firstColumn="1" w:lastColumn="0" w:noHBand="0" w:noVBand="1"/>
+        <w:tblLook w:val="0000" w:firstRow="0" w:lastRow="0" w:firstColumn="0" w:lastColumn="0" w:noHBand="0" w:noVBand="0"/>
       </w:tblPr>
       <w:tblGrid>
         <w:gridCol w:w="3000"/>
@@ -13663,7 +13949,7 @@
       <w:pPr>
         <w:pStyle w:val="Heading2"/>
       </w:pPr>
-      <w:bookmarkStart w:id="33" w:name="_Toc241614748"/>
+      <w:bookmarkStart w:id="33" w:name="_Toc241652134"/>
       <w:r>
         <w:t>8.2 Kategori PKWT</w:t>
       </w:r>
@@ -13692,7 +13978,7 @@
           <w:left w:w="10" w:type="dxa"/>
           <w:right w:w="10" w:type="dxa"/>
         </w:tblCellMar>
-        <w:tblLook w:val="04A0" w:firstRow="1" w:lastRow="0" w:firstColumn="1" w:lastColumn="0" w:noHBand="0" w:noVBand="1"/>
+        <w:tblLook w:val="0000" w:firstRow="0" w:lastRow="0" w:firstColumn="0" w:lastColumn="0" w:noHBand="0" w:noVBand="0"/>
       </w:tblPr>
       <w:tblGrid>
         <w:gridCol w:w="2500"/>
@@ -14173,7 +14459,7 @@
       <w:pPr>
         <w:pStyle w:val="Heading2"/>
       </w:pPr>
-      <w:bookmarkStart w:id="34" w:name="_Toc241614749"/>
+      <w:bookmarkStart w:id="34" w:name="_Toc241652135"/>
       <w:r>
         <w:t>8.3 Pola Kerja</w:t>
       </w:r>
@@ -14212,7 +14498,7 @@
           <w:left w:w="10" w:type="dxa"/>
           <w:right w:w="10" w:type="dxa"/>
         </w:tblCellMar>
-        <w:tblLook w:val="04A0" w:firstRow="1" w:lastRow="0" w:firstColumn="1" w:lastColumn="0" w:noHBand="0" w:noVBand="1"/>
+        <w:tblLook w:val="0000" w:firstRow="0" w:lastRow="0" w:firstColumn="0" w:lastColumn="0" w:noHBand="0" w:noVBand="0"/>
       </w:tblPr>
       <w:tblGrid>
         <w:gridCol w:w="2500"/>
@@ -15687,7 +15973,7 @@
         <w:pStyle w:val="Heading1"/>
         <w:pageBreakBefore/>
       </w:pPr>
-      <w:bookmarkStart w:id="35" w:name="_Toc241614750"/>
+      <w:bookmarkStart w:id="35" w:name="_Toc241652136"/>
       <w:r>
         <w:lastRenderedPageBreak/>
         <w:t>9. Kompensasi, Pola Kerja &amp; Payroll</w:t>
@@ -15698,7 +15984,7 @@
       <w:pPr>
         <w:pStyle w:val="Heading2"/>
       </w:pPr>
-      <w:bookmarkStart w:id="36" w:name="_Toc241614751"/>
+      <w:bookmarkStart w:id="36" w:name="_Toc241652137"/>
       <w:r>
         <w:t>9.1 Menu Kompensasi &amp; Benefit (PIC KB)</w:t>
       </w:r>
@@ -15719,7 +16005,7 @@
           <w:left w:w="10" w:type="dxa"/>
           <w:right w:w="10" w:type="dxa"/>
         </w:tblCellMar>
-        <w:tblLook w:val="04A0" w:firstRow="1" w:lastRow="0" w:firstColumn="1" w:lastColumn="0" w:noHBand="0" w:noVBand="1"/>
+        <w:tblLook w:val="0000" w:firstRow="0" w:lastRow="0" w:firstColumn="0" w:lastColumn="0" w:noHBand="0" w:noVBand="0"/>
       </w:tblPr>
       <w:tblGrid>
         <w:gridCol w:w="3000"/>
@@ -16222,7 +16508,7 @@
       <w:pPr>
         <w:pStyle w:val="Heading2"/>
       </w:pPr>
-      <w:bookmarkStart w:id="37" w:name="_Toc241614752"/>
+      <w:bookmarkStart w:id="37" w:name="_Toc241652138"/>
       <w:r>
         <w:t>9.2 Persiapan data sebelum proses</w:t>
       </w:r>
@@ -16251,7 +16537,7 @@
           <w:left w:w="10" w:type="dxa"/>
           <w:right w:w="10" w:type="dxa"/>
         </w:tblCellMar>
-        <w:tblLook w:val="04A0" w:firstRow="1" w:lastRow="0" w:firstColumn="1" w:lastColumn="0" w:noHBand="0" w:noVBand="1"/>
+        <w:tblLook w:val="0000" w:firstRow="0" w:lastRow="0" w:firstColumn="0" w:lastColumn="0" w:noHBand="0" w:noVBand="0"/>
       </w:tblPr>
       <w:tblGrid>
         <w:gridCol w:w="600"/>
@@ -17054,7 +17340,7 @@
       <w:pPr>
         <w:pStyle w:val="Heading2"/>
       </w:pPr>
-      <w:bookmarkStart w:id="38" w:name="_Toc241614753"/>
+      <w:bookmarkStart w:id="38" w:name="_Toc241652139"/>
       <w:r>
         <w:t>9.3 Komponen &amp; rumus</w:t>
       </w:r>
@@ -17075,7 +17361,7 @@
           <w:left w:w="10" w:type="dxa"/>
           <w:right w:w="10" w:type="dxa"/>
         </w:tblCellMar>
-        <w:tblLook w:val="04A0" w:firstRow="1" w:lastRow="0" w:firstColumn="1" w:lastColumn="0" w:noHBand="0" w:noVBand="1"/>
+        <w:tblLook w:val="0000" w:firstRow="0" w:lastRow="0" w:firstColumn="0" w:lastColumn="0" w:noHBand="0" w:noVBand="0"/>
       </w:tblPr>
       <w:tblGrid>
         <w:gridCol w:w="2700"/>
@@ -17826,7 +18112,7 @@
       <w:pPr>
         <w:pStyle w:val="Heading2"/>
       </w:pPr>
-      <w:bookmarkStart w:id="39" w:name="_Toc241614754"/>
+      <w:bookmarkStart w:id="39" w:name="_Toc241652140"/>
       <w:r>
         <w:t>9.4 Dampak kehadiran ke gaji</w:t>
       </w:r>
@@ -17847,7 +18133,7 @@
           <w:left w:w="10" w:type="dxa"/>
           <w:right w:w="10" w:type="dxa"/>
         </w:tblCellMar>
-        <w:tblLook w:val="04A0" w:firstRow="1" w:lastRow="0" w:firstColumn="1" w:lastColumn="0" w:noHBand="0" w:noVBand="1"/>
+        <w:tblLook w:val="0000" w:firstRow="0" w:lastRow="0" w:firstColumn="0" w:lastColumn="0" w:noHBand="0" w:noVBand="0"/>
       </w:tblPr>
       <w:tblGrid>
         <w:gridCol w:w="2800"/>
@@ -19153,7 +19439,7 @@
       <w:pPr>
         <w:pStyle w:val="Heading2"/>
       </w:pPr>
-      <w:bookmarkStart w:id="40" w:name="_Toc241614755"/>
+      <w:bookmarkStart w:id="40" w:name="_Toc241652141"/>
       <w:r>
         <w:t>9.5 Simulasi perhitungan</w:t>
       </w:r>
@@ -19217,7 +19503,7 @@
           <w:left w:w="10" w:type="dxa"/>
           <w:right w:w="10" w:type="dxa"/>
         </w:tblCellMar>
-        <w:tblLook w:val="04A0" w:firstRow="1" w:lastRow="0" w:firstColumn="1" w:lastColumn="0" w:noHBand="0" w:noVBand="1"/>
+        <w:tblLook w:val="0000" w:firstRow="0" w:lastRow="0" w:firstColumn="0" w:lastColumn="0" w:noHBand="0" w:noVBand="0"/>
       </w:tblPr>
       <w:tblGrid>
         <w:gridCol w:w="2700"/>
@@ -20182,7 +20468,7 @@
           <w:left w:w="10" w:type="dxa"/>
           <w:right w:w="10" w:type="dxa"/>
         </w:tblCellMar>
-        <w:tblLook w:val="04A0" w:firstRow="1" w:lastRow="0" w:firstColumn="1" w:lastColumn="0" w:noHBand="0" w:noVBand="1"/>
+        <w:tblLook w:val="0000" w:firstRow="0" w:lastRow="0" w:firstColumn="0" w:lastColumn="0" w:noHBand="0" w:noVBand="0"/>
       </w:tblPr>
       <w:tblGrid>
         <w:gridCol w:w="2700"/>
@@ -21245,7 +21531,7 @@
           <w:left w:w="10" w:type="dxa"/>
           <w:right w:w="10" w:type="dxa"/>
         </w:tblCellMar>
-        <w:tblLook w:val="04A0" w:firstRow="1" w:lastRow="0" w:firstColumn="1" w:lastColumn="0" w:noHBand="0" w:noVBand="1"/>
+        <w:tblLook w:val="0000" w:firstRow="0" w:lastRow="0" w:firstColumn="0" w:lastColumn="0" w:noHBand="0" w:noVBand="0"/>
       </w:tblPr>
       <w:tblGrid>
         <w:gridCol w:w="2700"/>
@@ -22152,7 +22438,7 @@
       <w:pPr>
         <w:pStyle w:val="Heading2"/>
       </w:pPr>
-      <w:bookmarkStart w:id="41" w:name="_Toc241614756"/>
+      <w:bookmarkStart w:id="41" w:name="_Toc241652142"/>
       <w:r>
         <w:t>9.6 Proses payroll bulanan</w:t>
       </w:r>
@@ -22163,7 +22449,7 @@
         <w:pStyle w:val="ListParagraph"/>
         <w:numPr>
           <w:ilvl w:val="0"/>
-          <w:numId w:val="9"/>
+          <w:numId w:val="10"/>
         </w:numPr>
         <w:spacing w:after="60" w:line="276" w:lineRule="auto"/>
       </w:pPr>
@@ -22176,7 +22462,7 @@
         <w:pStyle w:val="ListParagraph"/>
         <w:numPr>
           <w:ilvl w:val="0"/>
-          <w:numId w:val="9"/>
+          <w:numId w:val="10"/>
         </w:numPr>
         <w:spacing w:after="60" w:line="276" w:lineRule="auto"/>
       </w:pPr>
@@ -22216,7 +22502,7 @@
         <w:pStyle w:val="ListParagraph"/>
         <w:numPr>
           <w:ilvl w:val="0"/>
-          <w:numId w:val="9"/>
+          <w:numId w:val="10"/>
         </w:numPr>
         <w:spacing w:after="60" w:line="276" w:lineRule="auto"/>
       </w:pPr>
@@ -22229,7 +22515,7 @@
         <w:pStyle w:val="ListParagraph"/>
         <w:numPr>
           <w:ilvl w:val="0"/>
-          <w:numId w:val="9"/>
+          <w:numId w:val="10"/>
         </w:numPr>
         <w:spacing w:after="60" w:line="276" w:lineRule="auto"/>
       </w:pPr>
@@ -22252,7 +22538,7 @@
         <w:pStyle w:val="ListParagraph"/>
         <w:numPr>
           <w:ilvl w:val="0"/>
-          <w:numId w:val="9"/>
+          <w:numId w:val="10"/>
         </w:numPr>
         <w:spacing w:after="60" w:line="276" w:lineRule="auto"/>
       </w:pPr>
@@ -22295,7 +22581,7 @@
         <w:pStyle w:val="ListParagraph"/>
         <w:numPr>
           <w:ilvl w:val="0"/>
-          <w:numId w:val="9"/>
+          <w:numId w:val="10"/>
         </w:numPr>
         <w:spacing w:after="60" w:line="276" w:lineRule="auto"/>
       </w:pPr>
@@ -22335,7 +22621,7 @@
         <w:pStyle w:val="ListParagraph"/>
         <w:numPr>
           <w:ilvl w:val="0"/>
-          <w:numId w:val="9"/>
+          <w:numId w:val="10"/>
         </w:numPr>
         <w:spacing w:after="60" w:line="276" w:lineRule="auto"/>
       </w:pPr>
@@ -22374,7 +22660,7 @@
       <w:pPr>
         <w:pStyle w:val="Heading2"/>
       </w:pPr>
-      <w:bookmarkStart w:id="42" w:name="_Toc241614757"/>
+      <w:bookmarkStart w:id="42" w:name="_Toc241652143"/>
       <w:r>
         <w:t>9.7 Isi slip gaji</w:t>
       </w:r>
@@ -22395,7 +22681,7 @@
           <w:left w:w="10" w:type="dxa"/>
           <w:right w:w="10" w:type="dxa"/>
         </w:tblCellMar>
-        <w:tblLook w:val="04A0" w:firstRow="1" w:lastRow="0" w:firstColumn="1" w:lastColumn="0" w:noHBand="0" w:noVBand="1"/>
+        <w:tblLook w:val="0000" w:firstRow="0" w:lastRow="0" w:firstColumn="0" w:lastColumn="0" w:noHBand="0" w:noVBand="0"/>
       </w:tblPr>
       <w:tblGrid>
         <w:gridCol w:w="2400"/>
@@ -22839,7 +23125,7 @@
       <w:pPr>
         <w:pStyle w:val="Heading2"/>
       </w:pPr>
-      <w:bookmarkStart w:id="43" w:name="_Toc241614758"/>
+      <w:bookmarkStart w:id="43" w:name="_Toc241652144"/>
       <w:r>
         <w:lastRenderedPageBreak/>
         <w:t>9.8 Checklist &amp; FAQ payroll</w:t>
@@ -22861,7 +23147,7 @@
           <w:left w:w="10" w:type="dxa"/>
           <w:right w:w="10" w:type="dxa"/>
         </w:tblCellMar>
-        <w:tblLook w:val="04A0" w:firstRow="1" w:lastRow="0" w:firstColumn="1" w:lastColumn="0" w:noHBand="0" w:noVBand="1"/>
+        <w:tblLook w:val="0000" w:firstRow="0" w:lastRow="0" w:firstColumn="0" w:lastColumn="0" w:noHBand="0" w:noVBand="0"/>
       </w:tblPr>
       <w:tblGrid>
         <w:gridCol w:w="3600"/>
@@ -23352,7 +23638,7 @@
         <w:pStyle w:val="Heading1"/>
         <w:pageBreakBefore/>
       </w:pPr>
-      <w:bookmarkStart w:id="44" w:name="_Toc241614759"/>
+      <w:bookmarkStart w:id="44" w:name="_Toc241652145"/>
       <w:r>
         <w:lastRenderedPageBreak/>
         <w:t>10. Kelola Lokasi &amp; Password</w:t>
@@ -23363,7 +23649,7 @@
       <w:pPr>
         <w:pStyle w:val="Heading2"/>
       </w:pPr>
-      <w:bookmarkStart w:id="45" w:name="_Toc241614760"/>
+      <w:bookmarkStart w:id="45" w:name="_Toc241652146"/>
       <w:r>
         <w:t>10.1 Kelola Lokasi (PIC KL)</w:t>
       </w:r>
@@ -23399,7 +23685,7 @@
       <w:pPr>
         <w:pStyle w:val="Heading2"/>
       </w:pPr>
-      <w:bookmarkStart w:id="46" w:name="_Toc241614761"/>
+      <w:bookmarkStart w:id="46" w:name="_Toc241652147"/>
       <w:r>
         <w:t>10.2 Password</w:t>
       </w:r>
@@ -23456,7 +23742,7 @@
         <w:pStyle w:val="Heading1"/>
         <w:pageBreakBefore/>
       </w:pPr>
-      <w:bookmarkStart w:id="47" w:name="_Toc241614762"/>
+      <w:bookmarkStart w:id="47" w:name="_Toc241652148"/>
       <w:r>
         <w:lastRenderedPageBreak/>
         <w:t>11. Troubleshooting &amp; FAQ</w:t>
@@ -23478,7 +23764,7 @@
           <w:left w:w="10" w:type="dxa"/>
           <w:right w:w="10" w:type="dxa"/>
         </w:tblCellMar>
-        <w:tblLook w:val="04A0" w:firstRow="1" w:lastRow="0" w:firstColumn="1" w:lastColumn="0" w:noHBand="0" w:noVBand="1"/>
+        <w:tblLook w:val="0000" w:firstRow="0" w:lastRow="0" w:firstColumn="0" w:lastColumn="0" w:noHBand="0" w:noVBand="0"/>
       </w:tblPr>
       <w:tblGrid>
         <w:gridCol w:w="3600"/>
@@ -24002,7 +24288,7 @@
                 <w:sz w:val="19"/>
                 <w:szCs w:val="19"/>
               </w:rPr>
-              <w:t>Tanpa sinyal muncul "HP ini belum disiapkan untuk absen offline"</w:t>
+              <w:t>Tanpa sinyal muncul "Data Anda belum tersimpan di HP ini"</w:t>
             </w:r>
           </w:p>
         </w:tc>
@@ -24027,7 +24313,7 @@
                 <w:sz w:val="19"/>
                 <w:szCs w:val="19"/>
               </w:rPr>
-              <w:t>HP belum pernah Siap Offline, atau Badge yang tersimpan milik orang lain. Buka Digital Badge sendiri saat ada sinyal.</w:t>
+              <w:t>Karyawan belum pernah login Badge-nya di HP itu saat ada sinyal. Login sekali saat ada sinyal sampai ✅ Siap Offline.</w:t>
             </w:r>
           </w:p>
         </w:tc>
@@ -24062,7 +24348,7 @@
                 <w:sz w:val="19"/>
                 <w:szCs w:val="19"/>
               </w:rPr>
-              <w:t>Absen offline ditolak "beda hari"</w:t>
+              <w:t>"HP ini sudah menyimpan 5 orang"</w:t>
             </w:r>
           </w:p>
         </w:tc>
@@ -24086,7 +24372,7 @@
                 <w:sz w:val="19"/>
                 <w:szCs w:val="19"/>
               </w:rPr>
-              <w:t>HP baru dapat sinyal keesokan harinya. HR cek &amp; Terima Manual di Monitoring → Log Offline.</w:t>
+              <w:t>Hapus salah satu nama di daftar Tersimpan di HP ini, lalu login ulang Badge.</w:t>
             </w:r>
           </w:p>
         </w:tc>
@@ -24122,7 +24408,7 @@
                 <w:sz w:val="19"/>
                 <w:szCs w:val="19"/>
               </w:rPr>
-              <w:t>Absen offline ditolak "Jam HP lebih maju"</w:t>
+              <w:t>PIN ditolak saat offline di HP teman</w:t>
             </w:r>
           </w:p>
         </w:tc>
@@ -24147,7 +24433,7 @@
                 <w:sz w:val="19"/>
                 <w:szCs w:val="19"/>
               </w:rPr>
-              <w:t>Jam HP diubah manual. Aktifkan tanggal &amp; jam otomatis di pengaturan HP.</w:t>
+              <w:t>PIN sudah diganti setelah menitip. Pakai PIN lama, atau login ulang di HP itu saat ada sinyal.</w:t>
             </w:r>
           </w:p>
         </w:tc>
@@ -24182,7 +24468,7 @@
                 <w:sz w:val="19"/>
                 <w:szCs w:val="19"/>
               </w:rPr>
-              <w:t>Tampilan halaman tidak berubah setelah update</w:t>
+              <w:t>Absen offline ditolak "beda hari"</w:t>
             </w:r>
           </w:p>
         </w:tc>
@@ -24206,7 +24492,7 @@
                 <w:sz w:val="19"/>
                 <w:szCs w:val="19"/>
               </w:rPr>
-              <w:t>Tekan Ctrl+Shift+R (hard refresh) untuk membuang cache browser.</w:t>
+              <w:t>HP baru dapat sinyal keesokan harinya. HR cek &amp; Terima Manual di Monitoring → Log Offline.</w:t>
             </w:r>
           </w:p>
         </w:tc>
@@ -24242,6 +24528,133 @@
                 <w:sz w:val="19"/>
                 <w:szCs w:val="19"/>
               </w:rPr>
+              <w:t>Absen offline ditolak "Jam HP lebih maju"</w:t>
+            </w:r>
+          </w:p>
+        </w:tc>
+        <w:tc>
+          <w:tcPr>
+            <w:tcW w:w="6038" w:type="dxa"/>
+            <w:shd w:val="clear" w:color="auto" w:fill="F3F5F8"/>
+            <w:tcMar>
+              <w:top w:w="70" w:type="dxa"/>
+              <w:left w:w="110" w:type="dxa"/>
+              <w:bottom w:w="70" w:type="dxa"/>
+              <w:right w:w="110" w:type="dxa"/>
+            </w:tcMar>
+            <w:vAlign w:val="center"/>
+          </w:tcPr>
+          <w:p>
+            <w:pPr>
+              <w:spacing w:after="20"/>
+            </w:pPr>
+            <w:r>
+              <w:rPr>
+                <w:sz w:val="19"/>
+                <w:szCs w:val="19"/>
+              </w:rPr>
+              <w:t>Jam HP diubah manual. Aktifkan tanggal &amp; jam otomatis di pengaturan HP.</w:t>
+            </w:r>
+          </w:p>
+        </w:tc>
+      </w:tr>
+      <w:tr>
+        <w:tblPrEx>
+          <w:tblCellMar>
+            <w:top w:w="0" w:type="dxa"/>
+            <w:bottom w:w="0" w:type="dxa"/>
+          </w:tblCellMar>
+        </w:tblPrEx>
+        <w:trPr>
+          <w:cantSplit/>
+        </w:trPr>
+        <w:tc>
+          <w:tcPr>
+            <w:tcW w:w="3600" w:type="dxa"/>
+            <w:tcMar>
+              <w:top w:w="70" w:type="dxa"/>
+              <w:left w:w="110" w:type="dxa"/>
+              <w:bottom w:w="70" w:type="dxa"/>
+              <w:right w:w="110" w:type="dxa"/>
+            </w:tcMar>
+            <w:vAlign w:val="center"/>
+          </w:tcPr>
+          <w:p>
+            <w:pPr>
+              <w:spacing w:after="20"/>
+            </w:pPr>
+            <w:r>
+              <w:rPr>
+                <w:sz w:val="19"/>
+                <w:szCs w:val="19"/>
+              </w:rPr>
+              <w:t>Tampilan halaman tidak berubah setelah update</w:t>
+            </w:r>
+          </w:p>
+        </w:tc>
+        <w:tc>
+          <w:tcPr>
+            <w:tcW w:w="6038" w:type="dxa"/>
+            <w:tcMar>
+              <w:top w:w="70" w:type="dxa"/>
+              <w:left w:w="110" w:type="dxa"/>
+              <w:bottom w:w="70" w:type="dxa"/>
+              <w:right w:w="110" w:type="dxa"/>
+            </w:tcMar>
+            <w:vAlign w:val="center"/>
+          </w:tcPr>
+          <w:p>
+            <w:pPr>
+              <w:spacing w:after="20"/>
+            </w:pPr>
+            <w:r>
+              <w:rPr>
+                <w:sz w:val="19"/>
+                <w:szCs w:val="19"/>
+              </w:rPr>
+              <w:t>Tekan Ctrl+Shift+R</w:t>
+            </w:r>
+            <w:r>
+              <w:rPr>
+                <w:sz w:val="19"/>
+                <w:szCs w:val="19"/>
+              </w:rPr>
+              <w:t xml:space="preserve"> (hard refresh) untuk membuang cache browser.</w:t>
+            </w:r>
+          </w:p>
+        </w:tc>
+      </w:tr>
+      <w:tr>
+        <w:tblPrEx>
+          <w:tblCellMar>
+            <w:top w:w="0" w:type="dxa"/>
+            <w:bottom w:w="0" w:type="dxa"/>
+          </w:tblCellMar>
+        </w:tblPrEx>
+        <w:trPr>
+          <w:cantSplit/>
+        </w:trPr>
+        <w:tc>
+          <w:tcPr>
+            <w:tcW w:w="3600" w:type="dxa"/>
+            <w:shd w:val="clear" w:color="auto" w:fill="F3F5F8"/>
+            <w:tcMar>
+              <w:top w:w="70" w:type="dxa"/>
+              <w:left w:w="110" w:type="dxa"/>
+              <w:bottom w:w="70" w:type="dxa"/>
+              <w:right w:w="110" w:type="dxa"/>
+            </w:tcMar>
+            <w:vAlign w:val="center"/>
+          </w:tcPr>
+          <w:p>
+            <w:pPr>
+              <w:spacing w:after="20"/>
+            </w:pPr>
+            <w:r>
+              <w:rPr>
+                <w:sz w:val="19"/>
+                <w:szCs w:val="19"/>
+              </w:rPr>
               <w:t>Nilai lembur di slip tidak sesuai harapan</w:t>
             </w:r>
           </w:p>
@@ -24282,7 +24695,7 @@
       <w:pPr>
         <w:pStyle w:val="Heading2"/>
       </w:pPr>
-      <w:bookmarkStart w:id="48" w:name="_Toc241614763"/>
+      <w:bookmarkStart w:id="48" w:name="_Toc241652149"/>
       <w:r>
         <w:t>Kontak dukungan</w:t>
       </w:r>
@@ -24421,7 +24834,7 @@
         <w:sz w:val="16"/>
         <w:szCs w:val="16"/>
       </w:rPr>
-      <w:t>Guide Operation Book — SmartGate Fusion4 v5.1</w:t>
+      <w:t>Guide Operation Book — SmartGate Fusion4 v5.2</w:t>
     </w:r>
   </w:p>
 </w:hdr>
@@ -24430,230 +24843,10 @@
 <file path=word/numbering.xml><?xml version="1.0" encoding="utf-8"?>
 <w:numbering xmlns:wpc="http://schemas.microsoft.com/office/word/2010/wordprocessingCanvas" xmlns:cx="http://schemas.microsoft.com/office/drawing/2014/chartex" xmlns:cx1="http://schemas.microsoft.com/office/drawing/2015/9/8/chartex" xmlns:cx2="http://schemas.microsoft.com/office/drawing/2015/10/21/chartex" xmlns:cx3="http://schemas.microsoft.com/office/drawing/2016/5/9/chartex" xmlns:cx4="http://schemas.microsoft.com/office/drawing/2016/5/10/chartex" xmlns:cx5="http://schemas.microsoft.com/office/drawing/2016/5/11/chartex" xmlns:cx6="http://schemas.microsoft.com/office/drawing/2016/5/12/chartex" xmlns:cx7="http://schemas.microsoft.com/office/drawing/2016/5/13/chartex" xmlns:cx8="http://schemas.microsoft.com/office/drawing/2016/5/14/chartex" xmlns:mc="http://schemas.openxmlformats.org/markup-compatibility/2006" xmlns:aink="http://schemas.microsoft.com/office/drawing/2016/ink" xmlns:am3d="http://schemas.microsoft.com/office/drawing/2017/model3d" xmlns:o="urn:schemas-microsoft-com:office:office" xmlns:oel="http://schemas.microsoft.com/office/2019/extlst" xmlns:r="http://schemas.openxmlformats.org/officeDocument/2006/relationships" xmlns:m="http://schemas.openxmlformats.org/officeDocument/2006/math" xmlns:v="urn:schemas-microsoft-com:vml" xmlns:wp14="http://schemas.microsoft.com/office/word/2010/wordprocessingDrawing" xmlns:wp="http://schemas.openxmlformats.org/drawingml/2006/wordprocessingDrawing" xmlns:w10="urn:schemas-microsoft-com:office:word" xmlns:w="http://schemas.openxmlformats.org/wordprocessingml/2006/main" xmlns:w14="http://schemas.microsoft.com/office/word/2010/wordml" xmlns:w15="http://schemas.microsoft.com/office/word/2012/wordml" xmlns:w16cex="http://schemas.microsoft.com/office/word/2018/wordml/cex" xmlns:w16cid="http://schemas.microsoft.com/office/word/2016/wordml/cid" xmlns:w16="http://schemas.microsoft.com/office/word/2018/wordml" xmlns:w16sdtdh="http://schemas.microsoft.com/office/word/2020/wordml/sdtdatahash" xmlns:w16se="http://schemas.microsoft.com/office/word/2015/wordml/symex" xmlns:wpg="http://schemas.microsoft.com/office/word/2010/wordprocessingGroup" xmlns:wpi="http://schemas.microsoft.com/office/word/2010/wordprocessingInk" xmlns:wne="http://schemas.microsoft.com/office/word/2006/wordml" xmlns:wps="http://schemas.microsoft.com/office/word/2010/wordprocessingShape" mc:Ignorable="w14 w15 w16se w16cid w16 w16cex w16sdtdh wp14">
   <w:abstractNum w:abstractNumId="0" w15:restartNumberingAfterBreak="0">
-    <w:nsid w:val="0BCE1258"/>
+    <w:nsid w:val="0CE8528A"/>
     <w:multiLevelType w:val="hybridMultilevel"/>
-    <w:tmpl w:val="B868058C"/>
-    <w:lvl w:ilvl="0" w:tplc="282814C4">
-      <w:start w:val="1"/>
-      <w:numFmt w:val="decimal"/>
-      <w:lvlText w:val="%1."/>
-      <w:lvlJc w:val="left"/>
-      <w:pPr>
-        <w:ind w:left="540" w:hanging="360"/>
-      </w:pPr>
-    </w:lvl>
-    <w:lvl w:ilvl="1" w:tplc="E20EE04C">
-      <w:numFmt w:val="decimal"/>
-      <w:lvlText w:val=""/>
-      <w:lvlJc w:val="left"/>
-    </w:lvl>
-    <w:lvl w:ilvl="2" w:tplc="4BB02AE4">
-      <w:numFmt w:val="decimal"/>
-      <w:lvlText w:val=""/>
-      <w:lvlJc w:val="left"/>
-    </w:lvl>
-    <w:lvl w:ilvl="3" w:tplc="E14A900A">
-      <w:numFmt w:val="decimal"/>
-      <w:lvlText w:val=""/>
-      <w:lvlJc w:val="left"/>
-    </w:lvl>
-    <w:lvl w:ilvl="4" w:tplc="4538FE66">
-      <w:numFmt w:val="decimal"/>
-      <w:lvlText w:val=""/>
-      <w:lvlJc w:val="left"/>
-    </w:lvl>
-    <w:lvl w:ilvl="5" w:tplc="16620D4E">
-      <w:numFmt w:val="decimal"/>
-      <w:lvlText w:val=""/>
-      <w:lvlJc w:val="left"/>
-    </w:lvl>
-    <w:lvl w:ilvl="6" w:tplc="EC749D86">
-      <w:numFmt w:val="decimal"/>
-      <w:lvlText w:val=""/>
-      <w:lvlJc w:val="left"/>
-    </w:lvl>
-    <w:lvl w:ilvl="7" w:tplc="8B969126">
-      <w:numFmt w:val="decimal"/>
-      <w:lvlText w:val=""/>
-      <w:lvlJc w:val="left"/>
-    </w:lvl>
-    <w:lvl w:ilvl="8" w:tplc="D8B2CAB6">
-      <w:numFmt w:val="decimal"/>
-      <w:lvlText w:val=""/>
-      <w:lvlJc w:val="left"/>
-    </w:lvl>
-  </w:abstractNum>
-  <w:abstractNum w:abstractNumId="1" w15:restartNumberingAfterBreak="0">
-    <w:nsid w:val="162000B5"/>
-    <w:multiLevelType w:val="hybridMultilevel"/>
-    <w:tmpl w:val="9490C220"/>
-    <w:lvl w:ilvl="0" w:tplc="D654FE2E">
-      <w:start w:val="1"/>
-      <w:numFmt w:val="bullet"/>
-      <w:lvlText w:val="•"/>
-      <w:lvlJc w:val="left"/>
-      <w:pPr>
-        <w:ind w:left="540" w:hanging="300"/>
-      </w:pPr>
-    </w:lvl>
-    <w:lvl w:ilvl="1" w:tplc="CBDC6C24" w:tentative="1">
-      <w:start w:val="1"/>
-      <w:numFmt w:val="bullet"/>
-      <w:lvlText w:val="–"/>
-      <w:lvlJc w:val="left"/>
-      <w:pPr>
-        <w:ind w:left="1000" w:hanging="300"/>
-      </w:pPr>
-    </w:lvl>
-    <w:lvl w:ilvl="2" w:tplc="0A40AC46">
-      <w:numFmt w:val="decimal"/>
-      <w:lvlText w:val=""/>
-      <w:lvlJc w:val="left"/>
-    </w:lvl>
-    <w:lvl w:ilvl="3" w:tplc="7F00BA0A">
-      <w:numFmt w:val="decimal"/>
-      <w:lvlText w:val=""/>
-      <w:lvlJc w:val="left"/>
-    </w:lvl>
-    <w:lvl w:ilvl="4" w:tplc="9320C9EA">
-      <w:numFmt w:val="decimal"/>
-      <w:lvlText w:val=""/>
-      <w:lvlJc w:val="left"/>
-    </w:lvl>
-    <w:lvl w:ilvl="5" w:tplc="CE44B3F4">
-      <w:numFmt w:val="decimal"/>
-      <w:lvlText w:val=""/>
-      <w:lvlJc w:val="left"/>
-    </w:lvl>
-    <w:lvl w:ilvl="6" w:tplc="0568ACB0">
-      <w:numFmt w:val="decimal"/>
-      <w:lvlText w:val=""/>
-      <w:lvlJc w:val="left"/>
-    </w:lvl>
-    <w:lvl w:ilvl="7" w:tplc="6B76F6CE">
-      <w:numFmt w:val="decimal"/>
-      <w:lvlText w:val=""/>
-      <w:lvlJc w:val="left"/>
-    </w:lvl>
-    <w:lvl w:ilvl="8" w:tplc="CE5A05D6">
-      <w:numFmt w:val="decimal"/>
-      <w:lvlText w:val=""/>
-      <w:lvlJc w:val="left"/>
-    </w:lvl>
-  </w:abstractNum>
-  <w:abstractNum w:abstractNumId="2" w15:restartNumberingAfterBreak="0">
-    <w:nsid w:val="2533554B"/>
-    <w:multiLevelType w:val="hybridMultilevel"/>
-    <w:tmpl w:val="BB86A0C0"/>
-    <w:lvl w:ilvl="0" w:tplc="55CA7E54">
-      <w:start w:val="1"/>
-      <w:numFmt w:val="decimal"/>
-      <w:lvlText w:val="%1."/>
-      <w:lvlJc w:val="left"/>
-      <w:pPr>
-        <w:ind w:left="540" w:hanging="360"/>
-      </w:pPr>
-    </w:lvl>
-    <w:lvl w:ilvl="1" w:tplc="F224CE3A">
-      <w:numFmt w:val="decimal"/>
-      <w:lvlText w:val=""/>
-      <w:lvlJc w:val="left"/>
-    </w:lvl>
-    <w:lvl w:ilvl="2" w:tplc="24BA4E4C">
-      <w:numFmt w:val="decimal"/>
-      <w:lvlText w:val=""/>
-      <w:lvlJc w:val="left"/>
-    </w:lvl>
-    <w:lvl w:ilvl="3" w:tplc="13D8B1F4">
-      <w:numFmt w:val="decimal"/>
-      <w:lvlText w:val=""/>
-      <w:lvlJc w:val="left"/>
-    </w:lvl>
-    <w:lvl w:ilvl="4" w:tplc="6CD0F090">
-      <w:numFmt w:val="decimal"/>
-      <w:lvlText w:val=""/>
-      <w:lvlJc w:val="left"/>
-    </w:lvl>
-    <w:lvl w:ilvl="5" w:tplc="8E1E7B3E">
-      <w:numFmt w:val="decimal"/>
-      <w:lvlText w:val=""/>
-      <w:lvlJc w:val="left"/>
-    </w:lvl>
-    <w:lvl w:ilvl="6" w:tplc="71A2B882">
-      <w:numFmt w:val="decimal"/>
-      <w:lvlText w:val=""/>
-      <w:lvlJc w:val="left"/>
-    </w:lvl>
-    <w:lvl w:ilvl="7" w:tplc="C3540B56">
-      <w:numFmt w:val="decimal"/>
-      <w:lvlText w:val=""/>
-      <w:lvlJc w:val="left"/>
-    </w:lvl>
-    <w:lvl w:ilvl="8" w:tplc="3460B040">
-      <w:numFmt w:val="decimal"/>
-      <w:lvlText w:val=""/>
-      <w:lvlJc w:val="left"/>
-    </w:lvl>
-  </w:abstractNum>
-  <w:abstractNum w:abstractNumId="3" w15:restartNumberingAfterBreak="0">
-    <w:nsid w:val="402E5C5A"/>
-    <w:multiLevelType w:val="hybridMultilevel"/>
-    <w:tmpl w:val="42F2B480"/>
-    <w:lvl w:ilvl="0" w:tplc="426A2FF0">
-      <w:start w:val="1"/>
-      <w:numFmt w:val="decimal"/>
-      <w:lvlText w:val="%1."/>
-      <w:lvlJc w:val="left"/>
-      <w:pPr>
-        <w:ind w:left="540" w:hanging="360"/>
-      </w:pPr>
-    </w:lvl>
-    <w:lvl w:ilvl="1" w:tplc="5240B9AA">
-      <w:numFmt w:val="decimal"/>
-      <w:lvlText w:val=""/>
-      <w:lvlJc w:val="left"/>
-    </w:lvl>
-    <w:lvl w:ilvl="2" w:tplc="5A0E3D06">
-      <w:numFmt w:val="decimal"/>
-      <w:lvlText w:val=""/>
-      <w:lvlJc w:val="left"/>
-    </w:lvl>
-    <w:lvl w:ilvl="3" w:tplc="9A821074">
-      <w:numFmt w:val="decimal"/>
-      <w:lvlText w:val=""/>
-      <w:lvlJc w:val="left"/>
-    </w:lvl>
-    <w:lvl w:ilvl="4" w:tplc="9086DE36">
-      <w:numFmt w:val="decimal"/>
-      <w:lvlText w:val=""/>
-      <w:lvlJc w:val="left"/>
-    </w:lvl>
-    <w:lvl w:ilvl="5" w:tplc="82B84C3C">
-      <w:numFmt w:val="decimal"/>
-      <w:lvlText w:val=""/>
-      <w:lvlJc w:val="left"/>
-    </w:lvl>
-    <w:lvl w:ilvl="6" w:tplc="23FE1CC2">
-      <w:numFmt w:val="decimal"/>
-      <w:lvlText w:val=""/>
-      <w:lvlJc w:val="left"/>
-    </w:lvl>
-    <w:lvl w:ilvl="7" w:tplc="817CF4CE">
-      <w:numFmt w:val="decimal"/>
-      <w:lvlText w:val=""/>
-      <w:lvlJc w:val="left"/>
-    </w:lvl>
-    <w:lvl w:ilvl="8" w:tplc="12A0FDAC">
-      <w:numFmt w:val="decimal"/>
-      <w:lvlText w:val=""/>
-      <w:lvlJc w:val="left"/>
-    </w:lvl>
-  </w:abstractNum>
-  <w:abstractNum w:abstractNumId="4" w15:restartNumberingAfterBreak="0">
-    <w:nsid w:val="58CE3286"/>
-    <w:multiLevelType w:val="hybridMultilevel"/>
-    <w:tmpl w:val="DDA47BBC"/>
-    <w:lvl w:ilvl="0" w:tplc="5C42D07E" w:tentative="1">
+    <w:tmpl w:val="81F067BC"/>
+    <w:lvl w:ilvl="0" w:tplc="F0F0AE7A" w:tentative="1">
       <w:start w:val="1"/>
       <w:numFmt w:val="bullet"/>
       <w:lvlText w:val="●"/>
@@ -24662,7 +24855,7 @@
         <w:ind w:left="720" w:hanging="360"/>
       </w:pPr>
     </w:lvl>
-    <w:lvl w:ilvl="1" w:tplc="173E0BBE" w:tentative="1">
+    <w:lvl w:ilvl="1" w:tplc="1312FB0C" w:tentative="1">
       <w:start w:val="1"/>
       <w:numFmt w:val="bullet"/>
       <w:lvlText w:val="○"/>
@@ -24671,7 +24864,7 @@
         <w:ind w:left="1440" w:hanging="360"/>
       </w:pPr>
     </w:lvl>
-    <w:lvl w:ilvl="2" w:tplc="BEC8916C" w:tentative="1">
+    <w:lvl w:ilvl="2" w:tplc="B41C25F0" w:tentative="1">
       <w:start w:val="1"/>
       <w:numFmt w:val="bullet"/>
       <w:lvlText w:val="■"/>
@@ -24680,7 +24873,7 @@
         <w:ind w:left="2160" w:hanging="360"/>
       </w:pPr>
     </w:lvl>
-    <w:lvl w:ilvl="3" w:tplc="6EE0ED78" w:tentative="1">
+    <w:lvl w:ilvl="3" w:tplc="ED069C56" w:tentative="1">
       <w:start w:val="1"/>
       <w:numFmt w:val="bullet"/>
       <w:lvlText w:val="●"/>
@@ -24689,7 +24882,7 @@
         <w:ind w:left="2880" w:hanging="360"/>
       </w:pPr>
     </w:lvl>
-    <w:lvl w:ilvl="4" w:tplc="B3B00396" w:tentative="1">
+    <w:lvl w:ilvl="4" w:tplc="18DE6314" w:tentative="1">
       <w:start w:val="1"/>
       <w:numFmt w:val="bullet"/>
       <w:lvlText w:val="○"/>
@@ -24698,7 +24891,7 @@
         <w:ind w:left="3600" w:hanging="360"/>
       </w:pPr>
     </w:lvl>
-    <w:lvl w:ilvl="5" w:tplc="F9DACE8E" w:tentative="1">
+    <w:lvl w:ilvl="5" w:tplc="7228D154" w:tentative="1">
       <w:start w:val="1"/>
       <w:numFmt w:val="bullet"/>
       <w:lvlText w:val="■"/>
@@ -24707,7 +24900,7 @@
         <w:ind w:left="4320" w:hanging="360"/>
       </w:pPr>
     </w:lvl>
-    <w:lvl w:ilvl="6" w:tplc="D674DDA6" w:tentative="1">
+    <w:lvl w:ilvl="6" w:tplc="FF225FF4" w:tentative="1">
       <w:start w:val="1"/>
       <w:numFmt w:val="bullet"/>
       <w:lvlText w:val="●"/>
@@ -24716,7 +24909,7 @@
         <w:ind w:left="5040" w:hanging="360"/>
       </w:pPr>
     </w:lvl>
-    <w:lvl w:ilvl="7" w:tplc="C784B7F2" w:tentative="1">
+    <w:lvl w:ilvl="7" w:tplc="81089404" w:tentative="1">
       <w:start w:val="1"/>
       <w:numFmt w:val="bullet"/>
       <w:lvlText w:val="●"/>
@@ -24725,7 +24918,7 @@
         <w:ind w:left="5760" w:hanging="360"/>
       </w:pPr>
     </w:lvl>
-    <w:lvl w:ilvl="8" w:tplc="68783252" w:tentative="1">
+    <w:lvl w:ilvl="8" w:tplc="DF6E25A8" w:tentative="1">
       <w:start w:val="1"/>
       <w:numFmt w:val="bullet"/>
       <w:lvlText w:val="●"/>
@@ -24735,11 +24928,69 @@
       </w:pPr>
     </w:lvl>
   </w:abstractNum>
-  <w:abstractNum w:abstractNumId="5" w15:restartNumberingAfterBreak="0">
-    <w:nsid w:val="5DDA2D91"/>
+  <w:abstractNum w:abstractNumId="1" w15:restartNumberingAfterBreak="0">
+    <w:nsid w:val="137943C3"/>
     <w:multiLevelType w:val="hybridMultilevel"/>
-    <w:tmpl w:val="82A6B800"/>
-    <w:lvl w:ilvl="0" w:tplc="69AC8988">
+    <w:tmpl w:val="A2D07646"/>
+    <w:lvl w:ilvl="0" w:tplc="E6561D5A">
+      <w:start w:val="1"/>
+      <w:numFmt w:val="bullet"/>
+      <w:lvlText w:val="•"/>
+      <w:lvlJc w:val="left"/>
+      <w:pPr>
+        <w:ind w:left="540" w:hanging="300"/>
+      </w:pPr>
+    </w:lvl>
+    <w:lvl w:ilvl="1" w:tplc="479CBCEA" w:tentative="1">
+      <w:start w:val="1"/>
+      <w:numFmt w:val="bullet"/>
+      <w:lvlText w:val="–"/>
+      <w:lvlJc w:val="left"/>
+      <w:pPr>
+        <w:ind w:left="1000" w:hanging="300"/>
+      </w:pPr>
+    </w:lvl>
+    <w:lvl w:ilvl="2" w:tplc="FB4090B2">
+      <w:numFmt w:val="decimal"/>
+      <w:lvlText w:val=""/>
+      <w:lvlJc w:val="left"/>
+    </w:lvl>
+    <w:lvl w:ilvl="3" w:tplc="801C1262">
+      <w:numFmt w:val="decimal"/>
+      <w:lvlText w:val=""/>
+      <w:lvlJc w:val="left"/>
+    </w:lvl>
+    <w:lvl w:ilvl="4" w:tplc="87A2B4CE">
+      <w:numFmt w:val="decimal"/>
+      <w:lvlText w:val=""/>
+      <w:lvlJc w:val="left"/>
+    </w:lvl>
+    <w:lvl w:ilvl="5" w:tplc="F5FEA628">
+      <w:numFmt w:val="decimal"/>
+      <w:lvlText w:val=""/>
+      <w:lvlJc w:val="left"/>
+    </w:lvl>
+    <w:lvl w:ilvl="6" w:tplc="CD525B52">
+      <w:numFmt w:val="decimal"/>
+      <w:lvlText w:val=""/>
+      <w:lvlJc w:val="left"/>
+    </w:lvl>
+    <w:lvl w:ilvl="7" w:tplc="D2A8F20C">
+      <w:numFmt w:val="decimal"/>
+      <w:lvlText w:val=""/>
+      <w:lvlJc w:val="left"/>
+    </w:lvl>
+    <w:lvl w:ilvl="8" w:tplc="61C4396E">
+      <w:numFmt w:val="decimal"/>
+      <w:lvlText w:val=""/>
+      <w:lvlJc w:val="left"/>
+    </w:lvl>
+  </w:abstractNum>
+  <w:abstractNum w:abstractNumId="2" w15:restartNumberingAfterBreak="0">
+    <w:nsid w:val="172E7DF4"/>
+    <w:multiLevelType w:val="hybridMultilevel"/>
+    <w:tmpl w:val="A8AA052C"/>
+    <w:lvl w:ilvl="0" w:tplc="B8A05BBE">
       <w:start w:val="1"/>
       <w:numFmt w:val="decimal"/>
       <w:lvlText w:val="%1."/>
@@ -24748,52 +24999,52 @@
         <w:ind w:left="540" w:hanging="360"/>
       </w:pPr>
     </w:lvl>
-    <w:lvl w:ilvl="1" w:tplc="A9DE19AA">
+    <w:lvl w:ilvl="1" w:tplc="EAA669D0">
       <w:numFmt w:val="decimal"/>
       <w:lvlText w:val=""/>
       <w:lvlJc w:val="left"/>
     </w:lvl>
-    <w:lvl w:ilvl="2" w:tplc="E1F62910">
+    <w:lvl w:ilvl="2" w:tplc="C6A8BEA6">
       <w:numFmt w:val="decimal"/>
       <w:lvlText w:val=""/>
       <w:lvlJc w:val="left"/>
     </w:lvl>
-    <w:lvl w:ilvl="3" w:tplc="C6E6E882">
+    <w:lvl w:ilvl="3" w:tplc="91222A3A">
       <w:numFmt w:val="decimal"/>
       <w:lvlText w:val=""/>
       <w:lvlJc w:val="left"/>
     </w:lvl>
-    <w:lvl w:ilvl="4" w:tplc="7948417A">
+    <w:lvl w:ilvl="4" w:tplc="39A28514">
       <w:numFmt w:val="decimal"/>
       <w:lvlText w:val=""/>
       <w:lvlJc w:val="left"/>
     </w:lvl>
-    <w:lvl w:ilvl="5" w:tplc="4568F858">
+    <w:lvl w:ilvl="5" w:tplc="B226EB1A">
       <w:numFmt w:val="decimal"/>
       <w:lvlText w:val=""/>
       <w:lvlJc w:val="left"/>
     </w:lvl>
-    <w:lvl w:ilvl="6" w:tplc="FA702C34">
+    <w:lvl w:ilvl="6" w:tplc="E44CDAAC">
       <w:numFmt w:val="decimal"/>
       <w:lvlText w:val=""/>
       <w:lvlJc w:val="left"/>
     </w:lvl>
-    <w:lvl w:ilvl="7" w:tplc="14EE342C">
+    <w:lvl w:ilvl="7" w:tplc="8228AA32">
       <w:numFmt w:val="decimal"/>
       <w:lvlText w:val=""/>
       <w:lvlJc w:val="left"/>
     </w:lvl>
-    <w:lvl w:ilvl="8" w:tplc="CA04B0F6">
+    <w:lvl w:ilvl="8" w:tplc="DA18443E">
       <w:numFmt w:val="decimal"/>
       <w:lvlText w:val=""/>
       <w:lvlJc w:val="left"/>
     </w:lvl>
   </w:abstractNum>
-  <w:abstractNum w:abstractNumId="6" w15:restartNumberingAfterBreak="0">
-    <w:nsid w:val="643F0069"/>
+  <w:abstractNum w:abstractNumId="3" w15:restartNumberingAfterBreak="0">
+    <w:nsid w:val="36A877F1"/>
     <w:multiLevelType w:val="hybridMultilevel"/>
-    <w:tmpl w:val="F10E3F14"/>
-    <w:lvl w:ilvl="0" w:tplc="62CC8656">
+    <w:tmpl w:val="304637BA"/>
+    <w:lvl w:ilvl="0" w:tplc="579A23E6">
       <w:start w:val="1"/>
       <w:numFmt w:val="decimal"/>
       <w:lvlText w:val="%1."/>
@@ -24802,52 +25053,52 @@
         <w:ind w:left="540" w:hanging="360"/>
       </w:pPr>
     </w:lvl>
-    <w:lvl w:ilvl="1" w:tplc="39DC28CA">
+    <w:lvl w:ilvl="1" w:tplc="B2529BB0">
       <w:numFmt w:val="decimal"/>
       <w:lvlText w:val=""/>
       <w:lvlJc w:val="left"/>
     </w:lvl>
-    <w:lvl w:ilvl="2" w:tplc="227C4402">
+    <w:lvl w:ilvl="2" w:tplc="23106F48">
       <w:numFmt w:val="decimal"/>
       <w:lvlText w:val=""/>
       <w:lvlJc w:val="left"/>
     </w:lvl>
-    <w:lvl w:ilvl="3" w:tplc="7D580650">
+    <w:lvl w:ilvl="3" w:tplc="9A0E7572">
       <w:numFmt w:val="decimal"/>
       <w:lvlText w:val=""/>
       <w:lvlJc w:val="left"/>
     </w:lvl>
-    <w:lvl w:ilvl="4" w:tplc="63F416E6">
+    <w:lvl w:ilvl="4" w:tplc="0D2A5EDC">
       <w:numFmt w:val="decimal"/>
       <w:lvlText w:val=""/>
       <w:lvlJc w:val="left"/>
     </w:lvl>
-    <w:lvl w:ilvl="5" w:tplc="DF94CE84">
+    <w:lvl w:ilvl="5" w:tplc="B82CE05E">
       <w:numFmt w:val="decimal"/>
       <w:lvlText w:val=""/>
       <w:lvlJc w:val="left"/>
     </w:lvl>
-    <w:lvl w:ilvl="6" w:tplc="1C44DC5A">
+    <w:lvl w:ilvl="6" w:tplc="2A4636F4">
       <w:numFmt w:val="decimal"/>
       <w:lvlText w:val=""/>
       <w:lvlJc w:val="left"/>
     </w:lvl>
-    <w:lvl w:ilvl="7" w:tplc="2B76C19C">
+    <w:lvl w:ilvl="7" w:tplc="9D380B98">
       <w:numFmt w:val="decimal"/>
       <w:lvlText w:val=""/>
       <w:lvlJc w:val="left"/>
     </w:lvl>
-    <w:lvl w:ilvl="8" w:tplc="34B6B550">
+    <w:lvl w:ilvl="8" w:tplc="09BCBFC0">
       <w:numFmt w:val="decimal"/>
       <w:lvlText w:val=""/>
       <w:lvlJc w:val="left"/>
     </w:lvl>
   </w:abstractNum>
-  <w:abstractNum w:abstractNumId="7" w15:restartNumberingAfterBreak="0">
-    <w:nsid w:val="6ED70AAE"/>
+  <w:abstractNum w:abstractNumId="4" w15:restartNumberingAfterBreak="0">
+    <w:nsid w:val="47A55677"/>
     <w:multiLevelType w:val="hybridMultilevel"/>
-    <w:tmpl w:val="B01CB1CC"/>
-    <w:lvl w:ilvl="0" w:tplc="87622968">
+    <w:tmpl w:val="D9A2BEDA"/>
+    <w:lvl w:ilvl="0" w:tplc="56D8123A">
       <w:start w:val="1"/>
       <w:numFmt w:val="decimal"/>
       <w:lvlText w:val="%1."/>
@@ -24856,52 +25107,52 @@
         <w:ind w:left="540" w:hanging="360"/>
       </w:pPr>
     </w:lvl>
-    <w:lvl w:ilvl="1" w:tplc="E21AC3F8">
+    <w:lvl w:ilvl="1" w:tplc="B7BAC980">
       <w:numFmt w:val="decimal"/>
       <w:lvlText w:val=""/>
       <w:lvlJc w:val="left"/>
     </w:lvl>
-    <w:lvl w:ilvl="2" w:tplc="A1B62EB2">
+    <w:lvl w:ilvl="2" w:tplc="BF92F9C8">
       <w:numFmt w:val="decimal"/>
       <w:lvlText w:val=""/>
       <w:lvlJc w:val="left"/>
     </w:lvl>
-    <w:lvl w:ilvl="3" w:tplc="CDACCAB6">
+    <w:lvl w:ilvl="3" w:tplc="34AC13B6">
       <w:numFmt w:val="decimal"/>
       <w:lvlText w:val=""/>
       <w:lvlJc w:val="left"/>
     </w:lvl>
-    <w:lvl w:ilvl="4" w:tplc="51E05650">
+    <w:lvl w:ilvl="4" w:tplc="9AE821D6">
       <w:numFmt w:val="decimal"/>
       <w:lvlText w:val=""/>
       <w:lvlJc w:val="left"/>
     </w:lvl>
-    <w:lvl w:ilvl="5" w:tplc="CE866222">
+    <w:lvl w:ilvl="5" w:tplc="62D27C70">
       <w:numFmt w:val="decimal"/>
       <w:lvlText w:val=""/>
       <w:lvlJc w:val="left"/>
     </w:lvl>
-    <w:lvl w:ilvl="6" w:tplc="483EEC4C">
+    <w:lvl w:ilvl="6" w:tplc="77F21AC6">
       <w:numFmt w:val="decimal"/>
       <w:lvlText w:val=""/>
       <w:lvlJc w:val="left"/>
     </w:lvl>
-    <w:lvl w:ilvl="7" w:tplc="AED823A8">
+    <w:lvl w:ilvl="7" w:tplc="A7D0640C">
       <w:numFmt w:val="decimal"/>
       <w:lvlText w:val=""/>
       <w:lvlJc w:val="left"/>
     </w:lvl>
-    <w:lvl w:ilvl="8" w:tplc="6532BD74">
+    <w:lvl w:ilvl="8" w:tplc="B26205A4">
       <w:numFmt w:val="decimal"/>
       <w:lvlText w:val=""/>
       <w:lvlJc w:val="left"/>
     </w:lvl>
   </w:abstractNum>
-  <w:abstractNum w:abstractNumId="8" w15:restartNumberingAfterBreak="0">
-    <w:nsid w:val="77C647E2"/>
+  <w:abstractNum w:abstractNumId="5" w15:restartNumberingAfterBreak="0">
+    <w:nsid w:val="48EA084A"/>
     <w:multiLevelType w:val="hybridMultilevel"/>
-    <w:tmpl w:val="E380584C"/>
-    <w:lvl w:ilvl="0" w:tplc="B92C4EF2">
+    <w:tmpl w:val="52BA19FE"/>
+    <w:lvl w:ilvl="0" w:tplc="9E106FD0">
       <w:start w:val="1"/>
       <w:numFmt w:val="decimal"/>
       <w:lvlText w:val="%1."/>
@@ -24910,97 +25161,319 @@
         <w:ind w:left="540" w:hanging="360"/>
       </w:pPr>
     </w:lvl>
-    <w:lvl w:ilvl="1" w:tplc="155E0172">
+    <w:lvl w:ilvl="1" w:tplc="04CC7E1C">
       <w:numFmt w:val="decimal"/>
       <w:lvlText w:val=""/>
       <w:lvlJc w:val="left"/>
     </w:lvl>
-    <w:lvl w:ilvl="2" w:tplc="BB8C6212">
+    <w:lvl w:ilvl="2" w:tplc="95902FFC">
       <w:numFmt w:val="decimal"/>
       <w:lvlText w:val=""/>
       <w:lvlJc w:val="left"/>
     </w:lvl>
-    <w:lvl w:ilvl="3" w:tplc="D71AAA66">
+    <w:lvl w:ilvl="3" w:tplc="21D43772">
       <w:numFmt w:val="decimal"/>
       <w:lvlText w:val=""/>
       <w:lvlJc w:val="left"/>
     </w:lvl>
-    <w:lvl w:ilvl="4" w:tplc="AC4462D8">
+    <w:lvl w:ilvl="4" w:tplc="646E2E18">
       <w:numFmt w:val="decimal"/>
       <w:lvlText w:val=""/>
       <w:lvlJc w:val="left"/>
     </w:lvl>
-    <w:lvl w:ilvl="5" w:tplc="81F045C2">
+    <w:lvl w:ilvl="5" w:tplc="D1A0744C">
       <w:numFmt w:val="decimal"/>
       <w:lvlText w:val=""/>
       <w:lvlJc w:val="left"/>
     </w:lvl>
-    <w:lvl w:ilvl="6" w:tplc="8DAA4BCE">
+    <w:lvl w:ilvl="6" w:tplc="1F148812">
       <w:numFmt w:val="decimal"/>
       <w:lvlText w:val=""/>
       <w:lvlJc w:val="left"/>
     </w:lvl>
-    <w:lvl w:ilvl="7" w:tplc="74A2EF52">
+    <w:lvl w:ilvl="7" w:tplc="8E64FFE6">
       <w:numFmt w:val="decimal"/>
       <w:lvlText w:val=""/>
       <w:lvlJc w:val="left"/>
     </w:lvl>
-    <w:lvl w:ilvl="8" w:tplc="CA860038">
+    <w:lvl w:ilvl="8" w:tplc="C1A8CD28">
       <w:numFmt w:val="decimal"/>
       <w:lvlText w:val=""/>
       <w:lvlJc w:val="left"/>
     </w:lvl>
   </w:abstractNum>
-  <w:num w:numId="1" w16cid:durableId="1049259766">
+  <w:abstractNum w:abstractNumId="6" w15:restartNumberingAfterBreak="0">
+    <w:nsid w:val="65164EF5"/>
+    <w:multiLevelType w:val="hybridMultilevel"/>
+    <w:tmpl w:val="C2560680"/>
+    <w:lvl w:ilvl="0" w:tplc="AEF8E706">
+      <w:start w:val="1"/>
+      <w:numFmt w:val="decimal"/>
+      <w:lvlText w:val="%1."/>
+      <w:lvlJc w:val="left"/>
+      <w:pPr>
+        <w:ind w:left="540" w:hanging="360"/>
+      </w:pPr>
+    </w:lvl>
+    <w:lvl w:ilvl="1" w:tplc="808856FE">
+      <w:numFmt w:val="decimal"/>
+      <w:lvlText w:val=""/>
+      <w:lvlJc w:val="left"/>
+    </w:lvl>
+    <w:lvl w:ilvl="2" w:tplc="D02488CE">
+      <w:numFmt w:val="decimal"/>
+      <w:lvlText w:val=""/>
+      <w:lvlJc w:val="left"/>
+    </w:lvl>
+    <w:lvl w:ilvl="3" w:tplc="D76286FA">
+      <w:numFmt w:val="decimal"/>
+      <w:lvlText w:val=""/>
+      <w:lvlJc w:val="left"/>
+    </w:lvl>
+    <w:lvl w:ilvl="4" w:tplc="9DA06D7A">
+      <w:numFmt w:val="decimal"/>
+      <w:lvlText w:val=""/>
+      <w:lvlJc w:val="left"/>
+    </w:lvl>
+    <w:lvl w:ilvl="5" w:tplc="487AC73A">
+      <w:numFmt w:val="decimal"/>
+      <w:lvlText w:val=""/>
+      <w:lvlJc w:val="left"/>
+    </w:lvl>
+    <w:lvl w:ilvl="6" w:tplc="736684C4">
+      <w:numFmt w:val="decimal"/>
+      <w:lvlText w:val=""/>
+      <w:lvlJc w:val="left"/>
+    </w:lvl>
+    <w:lvl w:ilvl="7" w:tplc="DF2E8B7A">
+      <w:numFmt w:val="decimal"/>
+      <w:lvlText w:val=""/>
+      <w:lvlJc w:val="left"/>
+    </w:lvl>
+    <w:lvl w:ilvl="8" w:tplc="4A8C4936">
+      <w:numFmt w:val="decimal"/>
+      <w:lvlText w:val=""/>
+      <w:lvlJc w:val="left"/>
+    </w:lvl>
+  </w:abstractNum>
+  <w:abstractNum w:abstractNumId="7" w15:restartNumberingAfterBreak="0">
+    <w:nsid w:val="72D10519"/>
+    <w:multiLevelType w:val="hybridMultilevel"/>
+    <w:tmpl w:val="89C84A42"/>
+    <w:lvl w:ilvl="0" w:tplc="1EE6A5A2">
+      <w:start w:val="1"/>
+      <w:numFmt w:val="decimal"/>
+      <w:lvlText w:val="%1."/>
+      <w:lvlJc w:val="left"/>
+      <w:pPr>
+        <w:ind w:left="540" w:hanging="360"/>
+      </w:pPr>
+    </w:lvl>
+    <w:lvl w:ilvl="1" w:tplc="C9CC391C">
+      <w:numFmt w:val="decimal"/>
+      <w:lvlText w:val=""/>
+      <w:lvlJc w:val="left"/>
+    </w:lvl>
+    <w:lvl w:ilvl="2" w:tplc="6124FDC0">
+      <w:numFmt w:val="decimal"/>
+      <w:lvlText w:val=""/>
+      <w:lvlJc w:val="left"/>
+    </w:lvl>
+    <w:lvl w:ilvl="3" w:tplc="484C09C4">
+      <w:numFmt w:val="decimal"/>
+      <w:lvlText w:val=""/>
+      <w:lvlJc w:val="left"/>
+    </w:lvl>
+    <w:lvl w:ilvl="4" w:tplc="17824FEE">
+      <w:numFmt w:val="decimal"/>
+      <w:lvlText w:val=""/>
+      <w:lvlJc w:val="left"/>
+    </w:lvl>
+    <w:lvl w:ilvl="5" w:tplc="CE9CDF9C">
+      <w:numFmt w:val="decimal"/>
+      <w:lvlText w:val=""/>
+      <w:lvlJc w:val="left"/>
+    </w:lvl>
+    <w:lvl w:ilvl="6" w:tplc="264E04B6">
+      <w:numFmt w:val="decimal"/>
+      <w:lvlText w:val=""/>
+      <w:lvlJc w:val="left"/>
+    </w:lvl>
+    <w:lvl w:ilvl="7" w:tplc="01C894A4">
+      <w:numFmt w:val="decimal"/>
+      <w:lvlText w:val=""/>
+      <w:lvlJc w:val="left"/>
+    </w:lvl>
+    <w:lvl w:ilvl="8" w:tplc="00CAC106">
+      <w:numFmt w:val="decimal"/>
+      <w:lvlText w:val=""/>
+      <w:lvlJc w:val="left"/>
+    </w:lvl>
+  </w:abstractNum>
+  <w:abstractNum w:abstractNumId="8" w15:restartNumberingAfterBreak="0">
+    <w:nsid w:val="7A13070E"/>
+    <w:multiLevelType w:val="hybridMultilevel"/>
+    <w:tmpl w:val="854C5F18"/>
+    <w:lvl w:ilvl="0" w:tplc="B7769D46">
+      <w:start w:val="1"/>
+      <w:numFmt w:val="decimal"/>
+      <w:lvlText w:val="%1."/>
+      <w:lvlJc w:val="left"/>
+      <w:pPr>
+        <w:ind w:left="540" w:hanging="360"/>
+      </w:pPr>
+    </w:lvl>
+    <w:lvl w:ilvl="1" w:tplc="F8B86716">
+      <w:numFmt w:val="decimal"/>
+      <w:lvlText w:val=""/>
+      <w:lvlJc w:val="left"/>
+    </w:lvl>
+    <w:lvl w:ilvl="2" w:tplc="3BE89966">
+      <w:numFmt w:val="decimal"/>
+      <w:lvlText w:val=""/>
+      <w:lvlJc w:val="left"/>
+    </w:lvl>
+    <w:lvl w:ilvl="3" w:tplc="493C0B7E">
+      <w:numFmt w:val="decimal"/>
+      <w:lvlText w:val=""/>
+      <w:lvlJc w:val="left"/>
+    </w:lvl>
+    <w:lvl w:ilvl="4" w:tplc="1DFCB116">
+      <w:numFmt w:val="decimal"/>
+      <w:lvlText w:val=""/>
+      <w:lvlJc w:val="left"/>
+    </w:lvl>
+    <w:lvl w:ilvl="5" w:tplc="3B720606">
+      <w:numFmt w:val="decimal"/>
+      <w:lvlText w:val=""/>
+      <w:lvlJc w:val="left"/>
+    </w:lvl>
+    <w:lvl w:ilvl="6" w:tplc="63FE96B8">
+      <w:numFmt w:val="decimal"/>
+      <w:lvlText w:val=""/>
+      <w:lvlJc w:val="left"/>
+    </w:lvl>
+    <w:lvl w:ilvl="7" w:tplc="AEB03FFE">
+      <w:numFmt w:val="decimal"/>
+      <w:lvlText w:val=""/>
+      <w:lvlJc w:val="left"/>
+    </w:lvl>
+    <w:lvl w:ilvl="8" w:tplc="6D76E632">
+      <w:numFmt w:val="decimal"/>
+      <w:lvlText w:val=""/>
+      <w:lvlJc w:val="left"/>
+    </w:lvl>
+  </w:abstractNum>
+  <w:abstractNum w:abstractNumId="9" w15:restartNumberingAfterBreak="0">
+    <w:nsid w:val="7F1D4F81"/>
+    <w:multiLevelType w:val="hybridMultilevel"/>
+    <w:tmpl w:val="B25ACF08"/>
+    <w:lvl w:ilvl="0" w:tplc="FB4AF606">
+      <w:start w:val="1"/>
+      <w:numFmt w:val="decimal"/>
+      <w:lvlText w:val="%1."/>
+      <w:lvlJc w:val="left"/>
+      <w:pPr>
+        <w:ind w:left="540" w:hanging="360"/>
+      </w:pPr>
+    </w:lvl>
+    <w:lvl w:ilvl="1" w:tplc="E408C9DC">
+      <w:numFmt w:val="decimal"/>
+      <w:lvlText w:val=""/>
+      <w:lvlJc w:val="left"/>
+    </w:lvl>
+    <w:lvl w:ilvl="2" w:tplc="75EA1F7A">
+      <w:numFmt w:val="decimal"/>
+      <w:lvlText w:val=""/>
+      <w:lvlJc w:val="left"/>
+    </w:lvl>
+    <w:lvl w:ilvl="3" w:tplc="CEE26732">
+      <w:numFmt w:val="decimal"/>
+      <w:lvlText w:val=""/>
+      <w:lvlJc w:val="left"/>
+    </w:lvl>
+    <w:lvl w:ilvl="4" w:tplc="785613EE">
+      <w:numFmt w:val="decimal"/>
+      <w:lvlText w:val=""/>
+      <w:lvlJc w:val="left"/>
+    </w:lvl>
+    <w:lvl w:ilvl="5" w:tplc="E04C6102">
+      <w:numFmt w:val="decimal"/>
+      <w:lvlText w:val=""/>
+      <w:lvlJc w:val="left"/>
+    </w:lvl>
+    <w:lvl w:ilvl="6" w:tplc="E918BCA8">
+      <w:numFmt w:val="decimal"/>
+      <w:lvlText w:val=""/>
+      <w:lvlJc w:val="left"/>
+    </w:lvl>
+    <w:lvl w:ilvl="7" w:tplc="E9FA9B98">
+      <w:numFmt w:val="decimal"/>
+      <w:lvlText w:val=""/>
+      <w:lvlJc w:val="left"/>
+    </w:lvl>
+    <w:lvl w:ilvl="8" w:tplc="86888258">
+      <w:numFmt w:val="decimal"/>
+      <w:lvlText w:val=""/>
+      <w:lvlJc w:val="left"/>
+    </w:lvl>
+  </w:abstractNum>
+  <w:num w:numId="1" w16cid:durableId="1081289619">
+    <w:abstractNumId w:val="0"/>
+    <w:lvlOverride w:ilvl="0">
+      <w:startOverride w:val="1"/>
+    </w:lvlOverride>
+  </w:num>
+  <w:num w:numId="2" w16cid:durableId="1106464496">
+    <w:abstractNumId w:val="1"/>
+    <w:lvlOverride w:ilvl="0">
+      <w:startOverride w:val="1"/>
+    </w:lvlOverride>
+  </w:num>
+  <w:num w:numId="3" w16cid:durableId="227767881">
+    <w:abstractNumId w:val="2"/>
+    <w:lvlOverride w:ilvl="0">
+      <w:startOverride w:val="1"/>
+    </w:lvlOverride>
+  </w:num>
+  <w:num w:numId="4" w16cid:durableId="1156189986">
+    <w:abstractNumId w:val="5"/>
+    <w:lvlOverride w:ilvl="0">
+      <w:startOverride w:val="1"/>
+    </w:lvlOverride>
+  </w:num>
+  <w:num w:numId="5" w16cid:durableId="2053505070">
+    <w:abstractNumId w:val="3"/>
+    <w:lvlOverride w:ilvl="0">
+      <w:startOverride w:val="1"/>
+    </w:lvlOverride>
+  </w:num>
+  <w:num w:numId="6" w16cid:durableId="543099809">
+    <w:abstractNumId w:val="7"/>
+    <w:lvlOverride w:ilvl="0">
+      <w:startOverride w:val="1"/>
+    </w:lvlOverride>
+  </w:num>
+  <w:num w:numId="7" w16cid:durableId="1861502657">
+    <w:abstractNumId w:val="8"/>
+    <w:lvlOverride w:ilvl="0">
+      <w:startOverride w:val="1"/>
+    </w:lvlOverride>
+  </w:num>
+  <w:num w:numId="8" w16cid:durableId="2118522593">
+    <w:abstractNumId w:val="9"/>
+    <w:lvlOverride w:ilvl="0">
+      <w:startOverride w:val="1"/>
+    </w:lvlOverride>
+  </w:num>
+  <w:num w:numId="9" w16cid:durableId="1993950629">
     <w:abstractNumId w:val="4"/>
     <w:lvlOverride w:ilvl="0">
       <w:startOverride w:val="1"/>
     </w:lvlOverride>
   </w:num>
-  <w:num w:numId="2" w16cid:durableId="1777480469">
-    <w:abstractNumId w:val="1"/>
-    <w:lvlOverride w:ilvl="0">
-      <w:startOverride w:val="1"/>
-    </w:lvlOverride>
-  </w:num>
-  <w:num w:numId="3" w16cid:durableId="1726223541">
-    <w:abstractNumId w:val="3"/>
-    <w:lvlOverride w:ilvl="0">
-      <w:startOverride w:val="1"/>
-    </w:lvlOverride>
-  </w:num>
-  <w:num w:numId="4" w16cid:durableId="134415752">
-    <w:abstractNumId w:val="5"/>
-    <w:lvlOverride w:ilvl="0">
-      <w:startOverride w:val="1"/>
-    </w:lvlOverride>
-  </w:num>
-  <w:num w:numId="5" w16cid:durableId="31812970">
+  <w:num w:numId="10" w16cid:durableId="713232210">
     <w:abstractNumId w:val="6"/>
-    <w:lvlOverride w:ilvl="0">
-      <w:startOverride w:val="1"/>
-    </w:lvlOverride>
-  </w:num>
-  <w:num w:numId="6" w16cid:durableId="614798121">
-    <w:abstractNumId w:val="7"/>
-    <w:lvlOverride w:ilvl="0">
-      <w:startOverride w:val="1"/>
-    </w:lvlOverride>
-  </w:num>
-  <w:num w:numId="7" w16cid:durableId="834028829">
-    <w:abstractNumId w:val="2"/>
-    <w:lvlOverride w:ilvl="0">
-      <w:startOverride w:val="1"/>
-    </w:lvlOverride>
-  </w:num>
-  <w:num w:numId="8" w16cid:durableId="1350177821">
-    <w:abstractNumId w:val="0"/>
-    <w:lvlOverride w:ilvl="0">
-      <w:startOverride w:val="1"/>
-    </w:lvlOverride>
-  </w:num>
-  <w:num w:numId="9" w16cid:durableId="753402046">
-    <w:abstractNumId w:val="8"/>
     <w:lvlOverride w:ilvl="0">
       <w:startOverride w:val="1"/>
     </w:lvlOverride>
@@ -25644,7 +26117,7 @@
     <w:autoRedefine/>
     <w:uiPriority w:val="39"/>
     <w:unhideWhenUsed/>
-    <w:rsid w:val="00C35F71"/>
+    <w:rsid w:val="00482C35"/>
     <w:pPr>
       <w:spacing w:after="100"/>
     </w:pPr>
@@ -25656,7 +26129,7 @@
     <w:autoRedefine/>
     <w:uiPriority w:val="39"/>
     <w:unhideWhenUsed/>
-    <w:rsid w:val="00C35F71"/>
+    <w:rsid w:val="00482C35"/>
     <w:pPr>
       <w:spacing w:after="100"/>
       <w:ind w:left="210"/>

</xml_diff>